<commit_message>
feat(validation): add rule engine, orchestrator and validation REST API
</commit_message>
<xml_diff>
--- a/architecture/India_Claims_Automation_Platform_Architecture_and_Project_Context.docx
+++ b/architecture/India_Claims_Automation_Platform_Architecture_and_Project_Context.docx
@@ -1960,6 +1960,2033 @@
         </w:rPr>
       </w:pPr>
     </w:p>
+    <w:p>
+      <w:pPr>
+        <w:spacing w:after="160" w:line="259" w:lineRule="auto"/>
+        <w:rPr>
+          <w:b/>
+          <w:bCs/>
+        </w:rPr>
+      </w:pPr>
+      <w:r>
+        <w:rPr>
+          <w:b/>
+          <w:bCs/>
+        </w:rPr>
+        <w:t>Directly mapped or renamed fields</w:t>
+      </w:r>
+    </w:p>
+    <w:p>
+      <w:pPr>
+        <w:spacing w:after="160" w:line="259" w:lineRule="auto"/>
+      </w:pPr>
+      <w:r>
+        <w:t>These do not involve mathematical calculation.</w:t>
+      </w:r>
+      <w:r>
+        <w:t xml:space="preserve"> </w:t>
+      </w:r>
+      <w:r>
+        <w:t>These mappings should still be shown to the customer for confirmation, especially where their business terminology differs from IHX terminology.</w:t>
+      </w:r>
+    </w:p>
+    <w:p/>
+    <w:tbl>
+      <w:tblPr>
+        <w:tblW w:w="0" w:type="auto"/>
+        <w:tblCellSpacing w:w="15" w:type="dxa"/>
+        <w:tblCellMar>
+          <w:top w:w="15" w:type="dxa"/>
+          <w:left w:w="15" w:type="dxa"/>
+          <w:bottom w:w="15" w:type="dxa"/>
+          <w:right w:w="15" w:type="dxa"/>
+        </w:tblCellMar>
+        <w:tblLook w:val="04A0" w:firstRow="1" w:lastRow="0" w:firstColumn="1" w:lastColumn="0" w:noHBand="0" w:noVBand="1"/>
+      </w:tblPr>
+      <w:tblGrid>
+        <w:gridCol w:w="3119"/>
+        <w:gridCol w:w="2665"/>
+      </w:tblGrid>
+      <w:tr>
+        <w:trPr>
+          <w:tblHeader/>
+          <w:tblCellSpacing w:w="15" w:type="dxa"/>
+        </w:trPr>
+        <w:tc>
+          <w:tcPr>
+            <w:tcW w:w="3074" w:type="dxa"/>
+            <w:vAlign w:val="center"/>
+            <w:hideMark/>
+          </w:tcPr>
+          <w:p>
+            <w:pPr>
+              <w:spacing w:after="160" w:line="259" w:lineRule="auto"/>
+              <w:rPr>
+                <w:b/>
+                <w:bCs/>
+              </w:rPr>
+            </w:pPr>
+            <w:r>
+              <w:rPr>
+                <w:b/>
+                <w:bCs/>
+              </w:rPr>
+              <w:t>Customer-facing field</w:t>
+            </w:r>
+          </w:p>
+        </w:tc>
+        <w:tc>
+          <w:tcPr>
+            <w:tcW w:w="2560" w:type="dxa"/>
+            <w:vAlign w:val="center"/>
+            <w:hideMark/>
+          </w:tcPr>
+          <w:p>
+            <w:pPr>
+              <w:spacing w:after="160" w:line="259" w:lineRule="auto"/>
+              <w:rPr>
+                <w:b/>
+                <w:bCs/>
+              </w:rPr>
+            </w:pPr>
+            <w:r>
+              <w:rPr>
+                <w:b/>
+                <w:bCs/>
+              </w:rPr>
+              <w:t>Source field</w:t>
+            </w:r>
+          </w:p>
+        </w:tc>
+      </w:tr>
+      <w:tr>
+        <w:trPr>
+          <w:tblCellSpacing w:w="15" w:type="dxa"/>
+        </w:trPr>
+        <w:tc>
+          <w:tcPr>
+            <w:tcW w:w="3074" w:type="dxa"/>
+            <w:vAlign w:val="center"/>
+            <w:hideMark/>
+          </w:tcPr>
+          <w:p>
+            <w:pPr>
+              <w:spacing w:after="160" w:line="259" w:lineRule="auto"/>
+            </w:pPr>
+            <w:proofErr w:type="spellStart"/>
+            <w:r>
+              <w:t>admissionNumber</w:t>
+            </w:r>
+            <w:proofErr w:type="spellEnd"/>
+          </w:p>
+        </w:tc>
+        <w:tc>
+          <w:tcPr>
+            <w:tcW w:w="2560" w:type="dxa"/>
+            <w:vAlign w:val="center"/>
+            <w:hideMark/>
+          </w:tcPr>
+          <w:p>
+            <w:pPr>
+              <w:spacing w:after="160" w:line="259" w:lineRule="auto"/>
+            </w:pPr>
+            <w:proofErr w:type="spellStart"/>
+            <w:r>
+              <w:t>in_patient_number</w:t>
+            </w:r>
+            <w:proofErr w:type="spellEnd"/>
+          </w:p>
+        </w:tc>
+      </w:tr>
+      <w:tr>
+        <w:trPr>
+          <w:tblCellSpacing w:w="15" w:type="dxa"/>
+        </w:trPr>
+        <w:tc>
+          <w:tcPr>
+            <w:tcW w:w="3074" w:type="dxa"/>
+            <w:vAlign w:val="center"/>
+            <w:hideMark/>
+          </w:tcPr>
+          <w:p>
+            <w:pPr>
+              <w:spacing w:after="160" w:line="259" w:lineRule="auto"/>
+            </w:pPr>
+            <w:proofErr w:type="spellStart"/>
+            <w:r>
+              <w:t>admittedDate</w:t>
+            </w:r>
+            <w:proofErr w:type="spellEnd"/>
+          </w:p>
+        </w:tc>
+        <w:tc>
+          <w:tcPr>
+            <w:tcW w:w="2560" w:type="dxa"/>
+            <w:vAlign w:val="center"/>
+            <w:hideMark/>
+          </w:tcPr>
+          <w:p>
+            <w:pPr>
+              <w:spacing w:after="160" w:line="259" w:lineRule="auto"/>
+            </w:pPr>
+            <w:proofErr w:type="spellStart"/>
+            <w:r>
+              <w:t>date_of_admission</w:t>
+            </w:r>
+            <w:proofErr w:type="spellEnd"/>
+          </w:p>
+        </w:tc>
+      </w:tr>
+      <w:tr>
+        <w:trPr>
+          <w:tblCellSpacing w:w="15" w:type="dxa"/>
+        </w:trPr>
+        <w:tc>
+          <w:tcPr>
+            <w:tcW w:w="3074" w:type="dxa"/>
+            <w:vAlign w:val="center"/>
+            <w:hideMark/>
+          </w:tcPr>
+          <w:p>
+            <w:pPr>
+              <w:spacing w:after="160" w:line="259" w:lineRule="auto"/>
+            </w:pPr>
+            <w:proofErr w:type="spellStart"/>
+            <w:r>
+              <w:t>dischargedDate</w:t>
+            </w:r>
+            <w:proofErr w:type="spellEnd"/>
+          </w:p>
+        </w:tc>
+        <w:tc>
+          <w:tcPr>
+            <w:tcW w:w="2560" w:type="dxa"/>
+            <w:vAlign w:val="center"/>
+            <w:hideMark/>
+          </w:tcPr>
+          <w:p>
+            <w:pPr>
+              <w:spacing w:after="160" w:line="259" w:lineRule="auto"/>
+            </w:pPr>
+            <w:proofErr w:type="spellStart"/>
+            <w:r>
+              <w:t>date_of_discharge</w:t>
+            </w:r>
+            <w:proofErr w:type="spellEnd"/>
+          </w:p>
+        </w:tc>
+      </w:tr>
+      <w:tr>
+        <w:trPr>
+          <w:tblCellSpacing w:w="15" w:type="dxa"/>
+        </w:trPr>
+        <w:tc>
+          <w:tcPr>
+            <w:tcW w:w="3074" w:type="dxa"/>
+            <w:vAlign w:val="center"/>
+            <w:hideMark/>
+          </w:tcPr>
+          <w:p>
+            <w:pPr>
+              <w:spacing w:after="160" w:line="259" w:lineRule="auto"/>
+            </w:pPr>
+            <w:proofErr w:type="spellStart"/>
+            <w:r>
+              <w:t>insuranceCompany</w:t>
+            </w:r>
+            <w:proofErr w:type="spellEnd"/>
+          </w:p>
+        </w:tc>
+        <w:tc>
+          <w:tcPr>
+            <w:tcW w:w="2560" w:type="dxa"/>
+            <w:vAlign w:val="center"/>
+            <w:hideMark/>
+          </w:tcPr>
+          <w:p>
+            <w:pPr>
+              <w:spacing w:after="160" w:line="259" w:lineRule="auto"/>
+            </w:pPr>
+            <w:proofErr w:type="spellStart"/>
+            <w:r>
+              <w:t>insurance_company_name</w:t>
+            </w:r>
+            <w:proofErr w:type="spellEnd"/>
+          </w:p>
+        </w:tc>
+      </w:tr>
+      <w:tr>
+        <w:trPr>
+          <w:tblCellSpacing w:w="15" w:type="dxa"/>
+        </w:trPr>
+        <w:tc>
+          <w:tcPr>
+            <w:tcW w:w="3074" w:type="dxa"/>
+            <w:vAlign w:val="center"/>
+            <w:hideMark/>
+          </w:tcPr>
+          <w:p>
+            <w:pPr>
+              <w:spacing w:after="160" w:line="259" w:lineRule="auto"/>
+            </w:pPr>
+            <w:proofErr w:type="spellStart"/>
+            <w:r>
+              <w:t>payorCompanyName</w:t>
+            </w:r>
+            <w:proofErr w:type="spellEnd"/>
+          </w:p>
+        </w:tc>
+        <w:tc>
+          <w:tcPr>
+            <w:tcW w:w="2560" w:type="dxa"/>
+            <w:vAlign w:val="center"/>
+            <w:hideMark/>
+          </w:tcPr>
+          <w:p>
+            <w:pPr>
+              <w:spacing w:after="160" w:line="259" w:lineRule="auto"/>
+            </w:pPr>
+            <w:proofErr w:type="spellStart"/>
+            <w:r>
+              <w:t>tpa_name</w:t>
+            </w:r>
+            <w:proofErr w:type="spellEnd"/>
+          </w:p>
+        </w:tc>
+      </w:tr>
+      <w:tr>
+        <w:trPr>
+          <w:tblCellSpacing w:w="15" w:type="dxa"/>
+        </w:trPr>
+        <w:tc>
+          <w:tcPr>
+            <w:tcW w:w="3074" w:type="dxa"/>
+            <w:vAlign w:val="center"/>
+            <w:hideMark/>
+          </w:tcPr>
+          <w:p>
+            <w:pPr>
+              <w:spacing w:after="160" w:line="259" w:lineRule="auto"/>
+            </w:pPr>
+            <w:proofErr w:type="spellStart"/>
+            <w:r>
+              <w:t>claimAuthNumber</w:t>
+            </w:r>
+            <w:proofErr w:type="spellEnd"/>
+          </w:p>
+        </w:tc>
+        <w:tc>
+          <w:tcPr>
+            <w:tcW w:w="2560" w:type="dxa"/>
+            <w:vAlign w:val="center"/>
+            <w:hideMark/>
+          </w:tcPr>
+          <w:p>
+            <w:pPr>
+              <w:spacing w:after="160" w:line="259" w:lineRule="auto"/>
+            </w:pPr>
+            <w:proofErr w:type="spellStart"/>
+            <w:r>
+              <w:t>claim_number</w:t>
+            </w:r>
+            <w:proofErr w:type="spellEnd"/>
+          </w:p>
+        </w:tc>
+      </w:tr>
+      <w:tr>
+        <w:trPr>
+          <w:tblCellSpacing w:w="15" w:type="dxa"/>
+        </w:trPr>
+        <w:tc>
+          <w:tcPr>
+            <w:tcW w:w="3074" w:type="dxa"/>
+            <w:vAlign w:val="center"/>
+            <w:hideMark/>
+          </w:tcPr>
+          <w:p>
+            <w:pPr>
+              <w:spacing w:after="160" w:line="259" w:lineRule="auto"/>
+            </w:pPr>
+            <w:proofErr w:type="spellStart"/>
+            <w:r>
+              <w:t>billNumber</w:t>
+            </w:r>
+            <w:proofErr w:type="spellEnd"/>
+          </w:p>
+        </w:tc>
+        <w:tc>
+          <w:tcPr>
+            <w:tcW w:w="2560" w:type="dxa"/>
+            <w:vAlign w:val="center"/>
+            <w:hideMark/>
+          </w:tcPr>
+          <w:p>
+            <w:pPr>
+              <w:spacing w:after="160" w:line="259" w:lineRule="auto"/>
+            </w:pPr>
+            <w:proofErr w:type="spellStart"/>
+            <w:r>
+              <w:t>invoice_number</w:t>
+            </w:r>
+            <w:proofErr w:type="spellEnd"/>
+          </w:p>
+        </w:tc>
+      </w:tr>
+      <w:tr>
+        <w:trPr>
+          <w:tblCellSpacing w:w="15" w:type="dxa"/>
+        </w:trPr>
+        <w:tc>
+          <w:tcPr>
+            <w:tcW w:w="3074" w:type="dxa"/>
+            <w:vAlign w:val="center"/>
+            <w:hideMark/>
+          </w:tcPr>
+          <w:p>
+            <w:pPr>
+              <w:spacing w:after="160" w:line="259" w:lineRule="auto"/>
+            </w:pPr>
+            <w:proofErr w:type="spellStart"/>
+            <w:r>
+              <w:t>billAmount</w:t>
+            </w:r>
+            <w:proofErr w:type="spellEnd"/>
+          </w:p>
+        </w:tc>
+        <w:tc>
+          <w:tcPr>
+            <w:tcW w:w="2560" w:type="dxa"/>
+            <w:vAlign w:val="center"/>
+            <w:hideMark/>
+          </w:tcPr>
+          <w:p>
+            <w:pPr>
+              <w:spacing w:after="160" w:line="259" w:lineRule="auto"/>
+            </w:pPr>
+            <w:proofErr w:type="spellStart"/>
+            <w:r>
+              <w:t>claimed_amount</w:t>
+            </w:r>
+            <w:proofErr w:type="spellEnd"/>
+          </w:p>
+        </w:tc>
+      </w:tr>
+      <w:tr>
+        <w:trPr>
+          <w:tblCellSpacing w:w="15" w:type="dxa"/>
+        </w:trPr>
+        <w:tc>
+          <w:tcPr>
+            <w:tcW w:w="3074" w:type="dxa"/>
+            <w:vAlign w:val="center"/>
+            <w:hideMark/>
+          </w:tcPr>
+          <w:p>
+            <w:pPr>
+              <w:spacing w:after="160" w:line="259" w:lineRule="auto"/>
+            </w:pPr>
+            <w:proofErr w:type="spellStart"/>
+            <w:r>
+              <w:t>payorAmount</w:t>
+            </w:r>
+            <w:proofErr w:type="spellEnd"/>
+          </w:p>
+        </w:tc>
+        <w:tc>
+          <w:tcPr>
+            <w:tcW w:w="2560" w:type="dxa"/>
+            <w:vAlign w:val="center"/>
+            <w:hideMark/>
+          </w:tcPr>
+          <w:p>
+            <w:pPr>
+              <w:spacing w:after="160" w:line="259" w:lineRule="auto"/>
+            </w:pPr>
+            <w:proofErr w:type="spellStart"/>
+            <w:r>
+              <w:t>approved_amount</w:t>
+            </w:r>
+            <w:proofErr w:type="spellEnd"/>
+          </w:p>
+        </w:tc>
+      </w:tr>
+      <w:tr>
+        <w:trPr>
+          <w:tblCellSpacing w:w="15" w:type="dxa"/>
+        </w:trPr>
+        <w:tc>
+          <w:tcPr>
+            <w:tcW w:w="3074" w:type="dxa"/>
+            <w:vAlign w:val="center"/>
+            <w:hideMark/>
+          </w:tcPr>
+          <w:p>
+            <w:pPr>
+              <w:spacing w:after="160" w:line="259" w:lineRule="auto"/>
+            </w:pPr>
+            <w:proofErr w:type="spellStart"/>
+            <w:r>
+              <w:t>patientAmount</w:t>
+            </w:r>
+            <w:proofErr w:type="spellEnd"/>
+          </w:p>
+        </w:tc>
+        <w:tc>
+          <w:tcPr>
+            <w:tcW w:w="2560" w:type="dxa"/>
+            <w:vAlign w:val="center"/>
+            <w:hideMark/>
+          </w:tcPr>
+          <w:p>
+            <w:pPr>
+              <w:spacing w:after="160" w:line="259" w:lineRule="auto"/>
+            </w:pPr>
+            <w:proofErr w:type="spellStart"/>
+            <w:r>
+              <w:t>patient_paid_amount</w:t>
+            </w:r>
+            <w:proofErr w:type="spellEnd"/>
+          </w:p>
+        </w:tc>
+      </w:tr>
+      <w:tr>
+        <w:trPr>
+          <w:tblCellSpacing w:w="15" w:type="dxa"/>
+        </w:trPr>
+        <w:tc>
+          <w:tcPr>
+            <w:tcW w:w="3074" w:type="dxa"/>
+            <w:vAlign w:val="center"/>
+            <w:hideMark/>
+          </w:tcPr>
+          <w:p>
+            <w:pPr>
+              <w:spacing w:after="160" w:line="259" w:lineRule="auto"/>
+            </w:pPr>
+            <w:proofErr w:type="spellStart"/>
+            <w:r>
+              <w:t>amountReceived</w:t>
+            </w:r>
+            <w:proofErr w:type="spellEnd"/>
+          </w:p>
+        </w:tc>
+        <w:tc>
+          <w:tcPr>
+            <w:tcW w:w="2560" w:type="dxa"/>
+            <w:vAlign w:val="center"/>
+            <w:hideMark/>
+          </w:tcPr>
+          <w:p>
+            <w:pPr>
+              <w:spacing w:after="160" w:line="259" w:lineRule="auto"/>
+            </w:pPr>
+            <w:proofErr w:type="spellStart"/>
+            <w:r>
+              <w:t>settled_amount</w:t>
+            </w:r>
+            <w:proofErr w:type="spellEnd"/>
+          </w:p>
+        </w:tc>
+      </w:tr>
+      <w:tr>
+        <w:trPr>
+          <w:tblCellSpacing w:w="15" w:type="dxa"/>
+        </w:trPr>
+        <w:tc>
+          <w:tcPr>
+            <w:tcW w:w="3074" w:type="dxa"/>
+            <w:vAlign w:val="center"/>
+            <w:hideMark/>
+          </w:tcPr>
+          <w:p>
+            <w:pPr>
+              <w:spacing w:after="160" w:line="259" w:lineRule="auto"/>
+            </w:pPr>
+            <w:proofErr w:type="spellStart"/>
+            <w:r>
+              <w:t>tds</w:t>
+            </w:r>
+            <w:proofErr w:type="spellEnd"/>
+          </w:p>
+        </w:tc>
+        <w:tc>
+          <w:tcPr>
+            <w:tcW w:w="2560" w:type="dxa"/>
+            <w:vAlign w:val="center"/>
+            <w:hideMark/>
+          </w:tcPr>
+          <w:p>
+            <w:pPr>
+              <w:spacing w:after="160" w:line="259" w:lineRule="auto"/>
+            </w:pPr>
+            <w:proofErr w:type="spellStart"/>
+            <w:r>
+              <w:t>tds_amount</w:t>
+            </w:r>
+            <w:proofErr w:type="spellEnd"/>
+          </w:p>
+        </w:tc>
+      </w:tr>
+      <w:tr>
+        <w:trPr>
+          <w:tblCellSpacing w:w="15" w:type="dxa"/>
+        </w:trPr>
+        <w:tc>
+          <w:tcPr>
+            <w:tcW w:w="3074" w:type="dxa"/>
+            <w:vAlign w:val="center"/>
+            <w:hideMark/>
+          </w:tcPr>
+          <w:p>
+            <w:pPr>
+              <w:spacing w:after="160" w:line="259" w:lineRule="auto"/>
+            </w:pPr>
+            <w:proofErr w:type="spellStart"/>
+            <w:r>
+              <w:t>submissionDate</w:t>
+            </w:r>
+            <w:proofErr w:type="spellEnd"/>
+          </w:p>
+        </w:tc>
+        <w:tc>
+          <w:tcPr>
+            <w:tcW w:w="2560" w:type="dxa"/>
+            <w:vAlign w:val="center"/>
+            <w:hideMark/>
+          </w:tcPr>
+          <w:p>
+            <w:pPr>
+              <w:spacing w:after="160" w:line="259" w:lineRule="auto"/>
+            </w:pPr>
+            <w:proofErr w:type="spellStart"/>
+            <w:r>
+              <w:t>document_submission_date</w:t>
+            </w:r>
+            <w:proofErr w:type="spellEnd"/>
+          </w:p>
+        </w:tc>
+      </w:tr>
+      <w:tr>
+        <w:trPr>
+          <w:tblCellSpacing w:w="15" w:type="dxa"/>
+        </w:trPr>
+        <w:tc>
+          <w:tcPr>
+            <w:tcW w:w="3074" w:type="dxa"/>
+            <w:vAlign w:val="center"/>
+            <w:hideMark/>
+          </w:tcPr>
+          <w:p>
+            <w:pPr>
+              <w:spacing w:after="160" w:line="259" w:lineRule="auto"/>
+            </w:pPr>
+            <w:proofErr w:type="spellStart"/>
+            <w:r>
+              <w:t>utrChequeNumber</w:t>
+            </w:r>
+            <w:proofErr w:type="spellEnd"/>
+          </w:p>
+        </w:tc>
+        <w:tc>
+          <w:tcPr>
+            <w:tcW w:w="2560" w:type="dxa"/>
+            <w:vAlign w:val="center"/>
+            <w:hideMark/>
+          </w:tcPr>
+          <w:p>
+            <w:pPr>
+              <w:spacing w:after="160" w:line="259" w:lineRule="auto"/>
+            </w:pPr>
+            <w:proofErr w:type="spellStart"/>
+            <w:r>
+              <w:t>cheque_neft_utr_number</w:t>
+            </w:r>
+            <w:proofErr w:type="spellEnd"/>
+          </w:p>
+        </w:tc>
+      </w:tr>
+      <w:tr>
+        <w:trPr>
+          <w:tblCellSpacing w:w="15" w:type="dxa"/>
+        </w:trPr>
+        <w:tc>
+          <w:tcPr>
+            <w:tcW w:w="3074" w:type="dxa"/>
+            <w:vAlign w:val="center"/>
+            <w:hideMark/>
+          </w:tcPr>
+          <w:p>
+            <w:pPr>
+              <w:spacing w:after="160" w:line="259" w:lineRule="auto"/>
+            </w:pPr>
+            <w:proofErr w:type="spellStart"/>
+            <w:r>
+              <w:t>utrChequeDate</w:t>
+            </w:r>
+            <w:proofErr w:type="spellEnd"/>
+          </w:p>
+        </w:tc>
+        <w:tc>
+          <w:tcPr>
+            <w:tcW w:w="2560" w:type="dxa"/>
+            <w:vAlign w:val="center"/>
+            <w:hideMark/>
+          </w:tcPr>
+          <w:p>
+            <w:pPr>
+              <w:spacing w:after="160" w:line="259" w:lineRule="auto"/>
+            </w:pPr>
+            <w:proofErr w:type="spellStart"/>
+            <w:r>
+              <w:t>cheque_neft_utr_date</w:t>
+            </w:r>
+            <w:proofErr w:type="spellEnd"/>
+          </w:p>
+        </w:tc>
+      </w:tr>
+      <w:tr>
+        <w:trPr>
+          <w:tblCellSpacing w:w="15" w:type="dxa"/>
+        </w:trPr>
+        <w:tc>
+          <w:tcPr>
+            <w:tcW w:w="3074" w:type="dxa"/>
+            <w:vAlign w:val="center"/>
+          </w:tcPr>
+          <w:p/>
+          <w:p/>
+        </w:tc>
+        <w:tc>
+          <w:tcPr>
+            <w:tcW w:w="2560" w:type="dxa"/>
+            <w:vAlign w:val="center"/>
+          </w:tcPr>
+          <w:p/>
+        </w:tc>
+      </w:tr>
+    </w:tbl>
+    <w:p>
+      <w:pPr>
+        <w:spacing w:after="160" w:line="259" w:lineRule="auto"/>
+        <w:rPr>
+          <w:b/>
+          <w:bCs/>
+        </w:rPr>
+      </w:pPr>
+      <w:r>
+        <w:rPr>
+          <w:b/>
+          <w:bCs/>
+        </w:rPr>
+        <w:t>Calculated or fallback fields</w:t>
+      </w:r>
+    </w:p>
+    <w:p>
+      <w:pPr>
+        <w:spacing w:after="160" w:line="259" w:lineRule="auto"/>
+        <w:rPr>
+          <w:b/>
+          <w:bCs/>
+        </w:rPr>
+      </w:pPr>
+      <w:r>
+        <w:rPr>
+          <w:b/>
+          <w:bCs/>
+        </w:rPr>
+        <w:t>Total Discount Amount</w:t>
+      </w:r>
+    </w:p>
+    <w:p>
+      <w:pPr>
+        <w:spacing w:after="160" w:line="259" w:lineRule="auto"/>
+      </w:pPr>
+      <w:r>
+        <w:lastRenderedPageBreak/>
+        <w:t>Current logic:</w:t>
+      </w:r>
+    </w:p>
+    <w:p>
+      <w:pPr>
+        <w:spacing w:after="160" w:line="259" w:lineRule="auto"/>
+      </w:pPr>
+      <w:r>
+        <w:t>If manual Total Discount Amount exists:</w:t>
+      </w:r>
+    </w:p>
+    <w:p>
+      <w:pPr>
+        <w:spacing w:after="160" w:line="259" w:lineRule="auto"/>
+      </w:pPr>
+      <w:r>
+        <w:t xml:space="preserve">    use manual value</w:t>
+      </w:r>
+    </w:p>
+    <w:p>
+      <w:pPr>
+        <w:spacing w:after="160" w:line="259" w:lineRule="auto"/>
+      </w:pPr>
+      <w:r>
+        <w:t>Else:</w:t>
+      </w:r>
+    </w:p>
+    <w:p>
+      <w:pPr>
+        <w:spacing w:after="160" w:line="259" w:lineRule="auto"/>
+      </w:pPr>
+      <w:r>
+        <w:t xml:space="preserve">    use Hospital Discount</w:t>
+      </w:r>
+    </w:p>
+    <w:p>
+      <w:pPr>
+        <w:spacing w:after="160" w:line="259" w:lineRule="auto"/>
+      </w:pPr>
+      <w:r>
+        <w:t>Formula:</w:t>
+      </w:r>
+    </w:p>
+    <w:p>
+      <w:pPr>
+        <w:spacing w:after="160" w:line="259" w:lineRule="auto"/>
+      </w:pPr>
+      <w:proofErr w:type="spellStart"/>
+      <w:r>
+        <w:t>totalDiscountAmount</w:t>
+      </w:r>
+      <w:proofErr w:type="spellEnd"/>
+      <w:r>
+        <w:t xml:space="preserve"> = manual total discount override</w:t>
+      </w:r>
+    </w:p>
+    <w:p>
+      <w:pPr>
+        <w:spacing w:after="160" w:line="259" w:lineRule="auto"/>
+      </w:pPr>
+      <w:r>
+        <w:t xml:space="preserve">                      OR </w:t>
+      </w:r>
+      <w:proofErr w:type="spellStart"/>
+      <w:r>
+        <w:t>hospitalDiscount</w:t>
+      </w:r>
+      <w:proofErr w:type="spellEnd"/>
+    </w:p>
+    <w:p>
+      <w:pPr>
+        <w:spacing w:after="160" w:line="259" w:lineRule="auto"/>
+      </w:pPr>
+      <w:r>
+        <w:t>This needs confirmation because “total discount” may include:</w:t>
+      </w:r>
+    </w:p>
+    <w:p>
+      <w:pPr>
+        <w:spacing w:after="160" w:line="259" w:lineRule="auto"/>
+      </w:pPr>
+      <w:r>
+        <w:t>hospital discount</w:t>
+      </w:r>
+    </w:p>
+    <w:p>
+      <w:pPr>
+        <w:spacing w:after="160" w:line="259" w:lineRule="auto"/>
+      </w:pPr>
+      <w:r>
+        <w:t>+ payor discount</w:t>
+      </w:r>
+    </w:p>
+    <w:p>
+      <w:pPr>
+        <w:spacing w:after="160" w:line="259" w:lineRule="auto"/>
+      </w:pPr>
+      <w:r>
+        <w:t>+ patient discount</w:t>
+      </w:r>
+    </w:p>
+    <w:p>
+      <w:pPr>
+        <w:spacing w:after="160" w:line="259" w:lineRule="auto"/>
+      </w:pPr>
+      <w:r>
+        <w:t>The current implementation does not add those three together.</w:t>
+      </w:r>
+    </w:p>
+    <w:p>
+      <w:pPr>
+        <w:spacing w:after="160" w:line="259" w:lineRule="auto"/>
+      </w:pPr>
+      <w:r>
+        <w:pict w14:anchorId="17AED868">
+          <v:rect id="_x0000_i1025" style="width:0;height:1.5pt" o:hralign="center" o:hrstd="t" o:hr="t" fillcolor="#a0a0a0" stroked="f"/>
+        </w:pict>
+      </w:r>
+    </w:p>
+    <w:p>
+      <w:pPr>
+        <w:spacing w:after="160" w:line="259" w:lineRule="auto"/>
+        <w:rPr>
+          <w:b/>
+          <w:bCs/>
+        </w:rPr>
+      </w:pPr>
+      <w:r>
+        <w:rPr>
+          <w:b/>
+          <w:bCs/>
+        </w:rPr>
+        <w:t>Payor Net Amount</w:t>
+      </w:r>
+    </w:p>
+    <w:p>
+      <w:pPr>
+        <w:spacing w:after="160" w:line="259" w:lineRule="auto"/>
+      </w:pPr>
+      <w:r>
+        <w:t>Current logic:</w:t>
+      </w:r>
+    </w:p>
+    <w:p>
+      <w:pPr>
+        <w:spacing w:after="160" w:line="259" w:lineRule="auto"/>
+      </w:pPr>
+      <w:r>
+        <w:t>If manual Payor Net Amount override exists:</w:t>
+      </w:r>
+    </w:p>
+    <w:p>
+      <w:pPr>
+        <w:spacing w:after="160" w:line="259" w:lineRule="auto"/>
+      </w:pPr>
+      <w:r>
+        <w:t xml:space="preserve">    use override</w:t>
+      </w:r>
+    </w:p>
+    <w:p>
+      <w:pPr>
+        <w:spacing w:after="160" w:line="259" w:lineRule="auto"/>
+      </w:pPr>
+      <w:r>
+        <w:t>Else:</w:t>
+      </w:r>
+    </w:p>
+    <w:p>
+      <w:pPr>
+        <w:spacing w:after="160" w:line="259" w:lineRule="auto"/>
+      </w:pPr>
+      <w:r>
+        <w:t xml:space="preserve">    Approved Amount - Payor Discount</w:t>
+      </w:r>
+    </w:p>
+    <w:p>
+      <w:pPr>
+        <w:spacing w:after="160" w:line="259" w:lineRule="auto"/>
+      </w:pPr>
+      <w:r>
+        <w:t>Formula:</w:t>
+      </w:r>
+    </w:p>
+    <w:p>
+      <w:pPr>
+        <w:spacing w:after="160" w:line="259" w:lineRule="auto"/>
+      </w:pPr>
+      <w:proofErr w:type="spellStart"/>
+      <w:r>
+        <w:t>payorNetAmount</w:t>
+      </w:r>
+      <w:proofErr w:type="spellEnd"/>
+      <w:r>
+        <w:t xml:space="preserve"> = </w:t>
+      </w:r>
+      <w:proofErr w:type="spellStart"/>
+      <w:r>
+        <w:t>approvedAmount</w:t>
+      </w:r>
+      <w:proofErr w:type="spellEnd"/>
+      <w:r>
+        <w:t xml:space="preserve"> - </w:t>
+      </w:r>
+      <w:proofErr w:type="spellStart"/>
+      <w:r>
+        <w:t>payorDiscount</w:t>
+      </w:r>
+      <w:proofErr w:type="spellEnd"/>
+    </w:p>
+    <w:p>
+      <w:pPr>
+        <w:spacing w:after="160" w:line="259" w:lineRule="auto"/>
+      </w:pPr>
+      <w:r>
+        <w:t xml:space="preserve">When </w:t>
+      </w:r>
+      <w:proofErr w:type="spellStart"/>
+      <w:r>
+        <w:t>payorDiscount</w:t>
+      </w:r>
+      <w:proofErr w:type="spellEnd"/>
+      <w:r>
+        <w:t xml:space="preserve"> is blank, it is treated as zero:</w:t>
+      </w:r>
+    </w:p>
+    <w:p>
+      <w:pPr>
+        <w:spacing w:after="160" w:line="259" w:lineRule="auto"/>
+      </w:pPr>
+      <w:proofErr w:type="spellStart"/>
+      <w:r>
+        <w:t>payorNetAmount</w:t>
+      </w:r>
+      <w:proofErr w:type="spellEnd"/>
+      <w:r>
+        <w:t xml:space="preserve"> = </w:t>
+      </w:r>
+      <w:proofErr w:type="spellStart"/>
+      <w:r>
+        <w:t>approvedAmount</w:t>
+      </w:r>
+      <w:proofErr w:type="spellEnd"/>
+    </w:p>
+    <w:p>
+      <w:pPr>
+        <w:spacing w:after="160" w:line="259" w:lineRule="auto"/>
+      </w:pPr>
+      <w:r>
+        <w:t>This definitely needs customer confirmation.</w:t>
+      </w:r>
+    </w:p>
+    <w:p>
+      <w:pPr>
+        <w:spacing w:after="160" w:line="259" w:lineRule="auto"/>
+      </w:pPr>
+      <w:r>
+        <w:pict w14:anchorId="29B0D950">
+          <v:rect id="_x0000_i1026" style="width:0;height:1.5pt" o:hralign="center" o:hrstd="t" o:hr="t" fillcolor="#a0a0a0" stroked="f"/>
+        </w:pict>
+      </w:r>
+    </w:p>
+    <w:p>
+      <w:pPr>
+        <w:spacing w:after="160" w:line="259" w:lineRule="auto"/>
+        <w:rPr>
+          <w:b/>
+          <w:bCs/>
+        </w:rPr>
+      </w:pPr>
+      <w:r>
+        <w:rPr>
+          <w:b/>
+          <w:bCs/>
+        </w:rPr>
+        <w:t>Patient Net Amount</w:t>
+      </w:r>
+    </w:p>
+    <w:p>
+      <w:pPr>
+        <w:spacing w:after="160" w:line="259" w:lineRule="auto"/>
+      </w:pPr>
+      <w:r>
+        <w:t>Current logic:</w:t>
+      </w:r>
+    </w:p>
+    <w:p>
+      <w:pPr>
+        <w:spacing w:after="160" w:line="259" w:lineRule="auto"/>
+      </w:pPr>
+      <w:r>
+        <w:t>If manual Patient Net Amount override exists:</w:t>
+      </w:r>
+    </w:p>
+    <w:p>
+      <w:pPr>
+        <w:spacing w:after="160" w:line="259" w:lineRule="auto"/>
+      </w:pPr>
+      <w:r>
+        <w:lastRenderedPageBreak/>
+        <w:t xml:space="preserve">    use override</w:t>
+      </w:r>
+    </w:p>
+    <w:p>
+      <w:pPr>
+        <w:spacing w:after="160" w:line="259" w:lineRule="auto"/>
+      </w:pPr>
+      <w:r>
+        <w:t>Else:</w:t>
+      </w:r>
+    </w:p>
+    <w:p>
+      <w:pPr>
+        <w:spacing w:after="160" w:line="259" w:lineRule="auto"/>
+      </w:pPr>
+      <w:r>
+        <w:t xml:space="preserve">    Patient Paid Amount - Patient Discount</w:t>
+      </w:r>
+    </w:p>
+    <w:p>
+      <w:pPr>
+        <w:spacing w:after="160" w:line="259" w:lineRule="auto"/>
+      </w:pPr>
+      <w:r>
+        <w:t>Formula:</w:t>
+      </w:r>
+    </w:p>
+    <w:p>
+      <w:pPr>
+        <w:spacing w:after="160" w:line="259" w:lineRule="auto"/>
+      </w:pPr>
+      <w:proofErr w:type="spellStart"/>
+      <w:r>
+        <w:t>patientNetAmount</w:t>
+      </w:r>
+      <w:proofErr w:type="spellEnd"/>
+      <w:r>
+        <w:t xml:space="preserve"> = </w:t>
+      </w:r>
+      <w:proofErr w:type="spellStart"/>
+      <w:r>
+        <w:t>patientAmount</w:t>
+      </w:r>
+      <w:proofErr w:type="spellEnd"/>
+      <w:r>
+        <w:t xml:space="preserve"> - </w:t>
+      </w:r>
+      <w:proofErr w:type="spellStart"/>
+      <w:r>
+        <w:t>patientDiscount</w:t>
+      </w:r>
+      <w:proofErr w:type="spellEnd"/>
+    </w:p>
+    <w:p>
+      <w:pPr>
+        <w:spacing w:after="160" w:line="259" w:lineRule="auto"/>
+      </w:pPr>
+      <w:r>
+        <w:t xml:space="preserve">When </w:t>
+      </w:r>
+      <w:proofErr w:type="spellStart"/>
+      <w:r>
+        <w:t>patientDiscount</w:t>
+      </w:r>
+      <w:proofErr w:type="spellEnd"/>
+      <w:r>
+        <w:t xml:space="preserve"> is blank:</w:t>
+      </w:r>
+    </w:p>
+    <w:p>
+      <w:pPr>
+        <w:spacing w:after="160" w:line="259" w:lineRule="auto"/>
+      </w:pPr>
+      <w:proofErr w:type="spellStart"/>
+      <w:r>
+        <w:t>patientNetAmount</w:t>
+      </w:r>
+      <w:proofErr w:type="spellEnd"/>
+      <w:r>
+        <w:t xml:space="preserve"> = </w:t>
+      </w:r>
+      <w:proofErr w:type="spellStart"/>
+      <w:r>
+        <w:t>patientAmount</w:t>
+      </w:r>
+      <w:proofErr w:type="spellEnd"/>
+    </w:p>
+    <w:p>
+      <w:pPr>
+        <w:spacing w:after="160" w:line="259" w:lineRule="auto"/>
+      </w:pPr>
+      <w:r>
+        <w:t>This also requires customer confirmation.</w:t>
+      </w:r>
+    </w:p>
+    <w:p>
+      <w:pPr>
+        <w:spacing w:after="160" w:line="259" w:lineRule="auto"/>
+      </w:pPr>
+      <w:r>
+        <w:pict w14:anchorId="008D8924">
+          <v:rect id="_x0000_i1027" style="width:0;height:1.5pt" o:hralign="center" o:hrstd="t" o:hr="t" fillcolor="#a0a0a0" stroked="f"/>
+        </w:pict>
+      </w:r>
+    </w:p>
+    <w:p>
+      <w:pPr>
+        <w:spacing w:after="160" w:line="259" w:lineRule="auto"/>
+        <w:rPr>
+          <w:b/>
+          <w:bCs/>
+        </w:rPr>
+      </w:pPr>
+      <w:r>
+        <w:rPr>
+          <w:b/>
+          <w:bCs/>
+        </w:rPr>
+        <w:t>Amount Receivable</w:t>
+      </w:r>
+    </w:p>
+    <w:p>
+      <w:pPr>
+        <w:spacing w:after="160" w:line="259" w:lineRule="auto"/>
+      </w:pPr>
+      <w:r>
+        <w:t>Current logic:</w:t>
+      </w:r>
+    </w:p>
+    <w:p>
+      <w:pPr>
+        <w:spacing w:after="160" w:line="259" w:lineRule="auto"/>
+      </w:pPr>
+      <w:r>
+        <w:t>If manual Amount Receivable override exists:</w:t>
+      </w:r>
+    </w:p>
+    <w:p>
+      <w:pPr>
+        <w:spacing w:after="160" w:line="259" w:lineRule="auto"/>
+      </w:pPr>
+      <w:r>
+        <w:t xml:space="preserve">    use override</w:t>
+      </w:r>
+    </w:p>
+    <w:p>
+      <w:pPr>
+        <w:spacing w:after="160" w:line="259" w:lineRule="auto"/>
+      </w:pPr>
+      <w:r>
+        <w:t>Else:</w:t>
+      </w:r>
+    </w:p>
+    <w:p>
+      <w:pPr>
+        <w:spacing w:after="160" w:line="259" w:lineRule="auto"/>
+      </w:pPr>
+      <w:r>
+        <w:t xml:space="preserve">    Approved Amount - Settled Amount - TDS Amount</w:t>
+      </w:r>
+    </w:p>
+    <w:p>
+      <w:pPr>
+        <w:spacing w:after="160" w:line="259" w:lineRule="auto"/>
+      </w:pPr>
+      <w:r>
+        <w:t>Formula:</w:t>
+      </w:r>
+    </w:p>
+    <w:p>
+      <w:pPr>
+        <w:spacing w:after="160" w:line="259" w:lineRule="auto"/>
+      </w:pPr>
+      <w:proofErr w:type="spellStart"/>
+      <w:r>
+        <w:t>amountReceivable</w:t>
+      </w:r>
+      <w:proofErr w:type="spellEnd"/>
+      <w:r>
+        <w:t xml:space="preserve"> =</w:t>
+      </w:r>
+      <w:r>
+        <w:t xml:space="preserve"> </w:t>
+      </w:r>
+      <w:r>
+        <w:t xml:space="preserve">    </w:t>
+      </w:r>
+      <w:proofErr w:type="spellStart"/>
+      <w:r>
+        <w:t>approvedAmount</w:t>
+      </w:r>
+      <w:proofErr w:type="spellEnd"/>
+      <w:r>
+        <w:t xml:space="preserve"> </w:t>
+      </w:r>
+      <w:r>
+        <w:t xml:space="preserve">    - </w:t>
+      </w:r>
+      <w:proofErr w:type="spellStart"/>
+      <w:r>
+        <w:t>amountReceived</w:t>
+      </w:r>
+      <w:proofErr w:type="spellEnd"/>
+      <w:r>
+        <w:t xml:space="preserve"> </w:t>
+      </w:r>
+      <w:r>
+        <w:t xml:space="preserve">    - </w:t>
+      </w:r>
+      <w:proofErr w:type="spellStart"/>
+      <w:r>
+        <w:t>tds</w:t>
+      </w:r>
+      <w:proofErr w:type="spellEnd"/>
+    </w:p>
+    <w:p>
+      <w:pPr>
+        <w:spacing w:after="160" w:line="259" w:lineRule="auto"/>
+      </w:pPr>
+      <w:r>
+        <w:t>Example:</w:t>
+      </w:r>
+    </w:p>
+    <w:p>
+      <w:pPr>
+        <w:spacing w:after="160" w:line="259" w:lineRule="auto"/>
+      </w:pPr>
+      <w:r>
+        <w:t>Approved Amount = 100,000</w:t>
+      </w:r>
+    </w:p>
+    <w:p>
+      <w:pPr>
+        <w:spacing w:after="160" w:line="259" w:lineRule="auto"/>
+      </w:pPr>
+      <w:r>
+        <w:t xml:space="preserve">Settled </w:t>
+      </w:r>
+      <w:proofErr w:type="gramStart"/>
+      <w:r>
+        <w:t>Amount  =</w:t>
+      </w:r>
+      <w:proofErr w:type="gramEnd"/>
+      <w:r>
+        <w:t xml:space="preserve"> 85,000</w:t>
+      </w:r>
+    </w:p>
+    <w:p>
+      <w:pPr>
+        <w:spacing w:after="160" w:line="259" w:lineRule="auto"/>
+      </w:pPr>
+      <w:r>
+        <w:t>TDS             = 10,000</w:t>
+      </w:r>
+    </w:p>
+    <w:p>
+      <w:pPr>
+        <w:spacing w:after="160" w:line="259" w:lineRule="auto"/>
+      </w:pPr>
+    </w:p>
+    <w:p>
+      <w:pPr>
+        <w:spacing w:after="160" w:line="259" w:lineRule="auto"/>
+      </w:pPr>
+      <w:r>
+        <w:t>Amount Receivable = 5,000</w:t>
+      </w:r>
+    </w:p>
+    <w:p>
+      <w:pPr>
+        <w:spacing w:after="160" w:line="259" w:lineRule="auto"/>
+      </w:pPr>
+      <w:r>
+        <w:t>This is a reasonable starting formula, but the customer may consider TDS as already received/accounted for. In that case, they may prefer:</w:t>
+      </w:r>
+    </w:p>
+    <w:p>
+      <w:pPr>
+        <w:spacing w:after="160" w:line="259" w:lineRule="auto"/>
+      </w:pPr>
+      <w:proofErr w:type="spellStart"/>
+      <w:r>
+        <w:t>amountReceivable</w:t>
+      </w:r>
+      <w:proofErr w:type="spellEnd"/>
+      <w:r>
+        <w:t xml:space="preserve"> =</w:t>
+      </w:r>
+      <w:r>
+        <w:t xml:space="preserve"> </w:t>
+      </w:r>
+      <w:r>
+        <w:t xml:space="preserve">    </w:t>
+      </w:r>
+      <w:proofErr w:type="spellStart"/>
+      <w:r>
+        <w:t>approvedAmount</w:t>
+      </w:r>
+      <w:proofErr w:type="spellEnd"/>
+      <w:r>
+        <w:t xml:space="preserve"> </w:t>
+      </w:r>
+      <w:r>
+        <w:t xml:space="preserve">    - </w:t>
+      </w:r>
+      <w:proofErr w:type="spellStart"/>
+      <w:r>
+        <w:t>amountReceived</w:t>
+      </w:r>
+      <w:proofErr w:type="spellEnd"/>
+    </w:p>
+    <w:p>
+      <w:r>
+        <w:t>Therefore, this is the most important formula to confirm.</w:t>
+      </w:r>
+    </w:p>
+    <w:p>
+      <w:r>
+        <w:br w:type="page"/>
+      </w:r>
+    </w:p>
+    <w:p/>
+    <w:p>
+      <w:pPr>
+        <w:spacing w:after="160" w:line="259" w:lineRule="auto"/>
+        <w:rPr>
+          <w:b/>
+          <w:bCs/>
+        </w:rPr>
+      </w:pPr>
+      <w:r>
+        <w:rPr>
+          <w:b/>
+          <w:bCs/>
+        </w:rPr>
+        <w:t>Suggested customer confirmation sheet</w:t>
+      </w:r>
+    </w:p>
+    <w:p>
+      <w:pPr>
+        <w:spacing w:after="160" w:line="259" w:lineRule="auto"/>
+      </w:pPr>
+      <w:r>
+        <w:t>We should confirm these definitions:</w:t>
+      </w:r>
+    </w:p>
+    <w:tbl>
+      <w:tblPr>
+        <w:tblW w:w="0" w:type="auto"/>
+        <w:tblCellSpacing w:w="15" w:type="dxa"/>
+        <w:tblCellMar>
+          <w:top w:w="15" w:type="dxa"/>
+          <w:left w:w="15" w:type="dxa"/>
+          <w:bottom w:w="15" w:type="dxa"/>
+          <w:right w:w="15" w:type="dxa"/>
+        </w:tblCellMar>
+        <w:tblLook w:val="04A0" w:firstRow="1" w:lastRow="0" w:firstColumn="1" w:lastColumn="0" w:noHBand="0" w:noVBand="1"/>
+      </w:tblPr>
+      <w:tblGrid>
+        <w:gridCol w:w="2062"/>
+        <w:gridCol w:w="3665"/>
+        <w:gridCol w:w="3003"/>
+      </w:tblGrid>
+      <w:tr>
+        <w:trPr>
+          <w:tblHeader/>
+          <w:tblCellSpacing w:w="15" w:type="dxa"/>
+        </w:trPr>
+        <w:tc>
+          <w:tcPr>
+            <w:tcW w:w="2082" w:type="dxa"/>
+            <w:vAlign w:val="center"/>
+            <w:hideMark/>
+          </w:tcPr>
+          <w:p>
+            <w:pPr>
+              <w:spacing w:after="160" w:line="259" w:lineRule="auto"/>
+              <w:rPr>
+                <w:b/>
+                <w:bCs/>
+              </w:rPr>
+            </w:pPr>
+            <w:r>
+              <w:rPr>
+                <w:b/>
+                <w:bCs/>
+              </w:rPr>
+              <w:t>Customer field</w:t>
+            </w:r>
+          </w:p>
+        </w:tc>
+        <w:tc>
+          <w:tcPr>
+            <w:tcW w:w="3797" w:type="dxa"/>
+            <w:vAlign w:val="center"/>
+            <w:hideMark/>
+          </w:tcPr>
+          <w:p>
+            <w:pPr>
+              <w:spacing w:after="160" w:line="259" w:lineRule="auto"/>
+              <w:rPr>
+                <w:b/>
+                <w:bCs/>
+              </w:rPr>
+            </w:pPr>
+            <w:r>
+              <w:rPr>
+                <w:b/>
+                <w:bCs/>
+              </w:rPr>
+              <w:t xml:space="preserve">Current </w:t>
+            </w:r>
+            <w:proofErr w:type="spellStart"/>
+            <w:r>
+              <w:rPr>
+                <w:b/>
+                <w:bCs/>
+              </w:rPr>
+              <w:t>ClaimsBridge</w:t>
+            </w:r>
+            <w:proofErr w:type="spellEnd"/>
+            <w:r>
+              <w:rPr>
+                <w:b/>
+                <w:bCs/>
+              </w:rPr>
+              <w:t xml:space="preserve"> logic</w:t>
+            </w:r>
+          </w:p>
+        </w:tc>
+        <w:tc>
+          <w:tcPr>
+            <w:tcW w:w="3027" w:type="dxa"/>
+            <w:vAlign w:val="center"/>
+            <w:hideMark/>
+          </w:tcPr>
+          <w:p>
+            <w:pPr>
+              <w:spacing w:after="160" w:line="259" w:lineRule="auto"/>
+              <w:rPr>
+                <w:b/>
+                <w:bCs/>
+              </w:rPr>
+            </w:pPr>
+            <w:r>
+              <w:rPr>
+                <w:b/>
+                <w:bCs/>
+              </w:rPr>
+              <w:t>Confirmation required</w:t>
+            </w:r>
+          </w:p>
+        </w:tc>
+      </w:tr>
+      <w:tr>
+        <w:trPr>
+          <w:tblCellSpacing w:w="15" w:type="dxa"/>
+        </w:trPr>
+        <w:tc>
+          <w:tcPr>
+            <w:tcW w:w="2082" w:type="dxa"/>
+            <w:vAlign w:val="center"/>
+            <w:hideMark/>
+          </w:tcPr>
+          <w:p>
+            <w:pPr>
+              <w:spacing w:after="160" w:line="259" w:lineRule="auto"/>
+            </w:pPr>
+            <w:r>
+              <w:t>Bill Amount</w:t>
+            </w:r>
+          </w:p>
+        </w:tc>
+        <w:tc>
+          <w:tcPr>
+            <w:tcW w:w="3797" w:type="dxa"/>
+            <w:vAlign w:val="center"/>
+            <w:hideMark/>
+          </w:tcPr>
+          <w:p>
+            <w:pPr>
+              <w:spacing w:after="160" w:line="259" w:lineRule="auto"/>
+            </w:pPr>
+            <w:r>
+              <w:t>Claimed Amount</w:t>
+            </w:r>
+          </w:p>
+        </w:tc>
+        <w:tc>
+          <w:tcPr>
+            <w:tcW w:w="3027" w:type="dxa"/>
+            <w:vAlign w:val="center"/>
+            <w:hideMark/>
+          </w:tcPr>
+          <w:p>
+            <w:pPr>
+              <w:spacing w:after="160" w:line="259" w:lineRule="auto"/>
+            </w:pPr>
+            <w:r>
+              <w:t>Is claimed amount equal to final bill amount?</w:t>
+            </w:r>
+          </w:p>
+        </w:tc>
+      </w:tr>
+      <w:tr>
+        <w:trPr>
+          <w:tblCellSpacing w:w="15" w:type="dxa"/>
+        </w:trPr>
+        <w:tc>
+          <w:tcPr>
+            <w:tcW w:w="2082" w:type="dxa"/>
+            <w:vAlign w:val="center"/>
+            <w:hideMark/>
+          </w:tcPr>
+          <w:p>
+            <w:pPr>
+              <w:spacing w:after="160" w:line="259" w:lineRule="auto"/>
+            </w:pPr>
+            <w:r>
+              <w:t>Payor Amount</w:t>
+            </w:r>
+          </w:p>
+        </w:tc>
+        <w:tc>
+          <w:tcPr>
+            <w:tcW w:w="3797" w:type="dxa"/>
+            <w:vAlign w:val="center"/>
+            <w:hideMark/>
+          </w:tcPr>
+          <w:p>
+            <w:pPr>
+              <w:spacing w:after="160" w:line="259" w:lineRule="auto"/>
+            </w:pPr>
+            <w:r>
+              <w:t>Approved Amount</w:t>
+            </w:r>
+          </w:p>
+        </w:tc>
+        <w:tc>
+          <w:tcPr>
+            <w:tcW w:w="3027" w:type="dxa"/>
+            <w:vAlign w:val="center"/>
+            <w:hideMark/>
+          </w:tcPr>
+          <w:p>
+            <w:pPr>
+              <w:spacing w:after="160" w:line="259" w:lineRule="auto"/>
+            </w:pPr>
+            <w:r>
+              <w:t>Is this sanctioned payor liability?</w:t>
+            </w:r>
+          </w:p>
+        </w:tc>
+      </w:tr>
+      <w:tr>
+        <w:trPr>
+          <w:tblCellSpacing w:w="15" w:type="dxa"/>
+        </w:trPr>
+        <w:tc>
+          <w:tcPr>
+            <w:tcW w:w="2082" w:type="dxa"/>
+            <w:vAlign w:val="center"/>
+            <w:hideMark/>
+          </w:tcPr>
+          <w:p>
+            <w:pPr>
+              <w:spacing w:after="160" w:line="259" w:lineRule="auto"/>
+            </w:pPr>
+            <w:r>
+              <w:t>Patient Amount</w:t>
+            </w:r>
+          </w:p>
+        </w:tc>
+        <w:tc>
+          <w:tcPr>
+            <w:tcW w:w="3797" w:type="dxa"/>
+            <w:vAlign w:val="center"/>
+            <w:hideMark/>
+          </w:tcPr>
+          <w:p>
+            <w:pPr>
+              <w:spacing w:after="160" w:line="259" w:lineRule="auto"/>
+            </w:pPr>
+            <w:r>
+              <w:t>Patient Paid Amount</w:t>
+            </w:r>
+          </w:p>
+        </w:tc>
+        <w:tc>
+          <w:tcPr>
+            <w:tcW w:w="3027" w:type="dxa"/>
+            <w:vAlign w:val="center"/>
+            <w:hideMark/>
+          </w:tcPr>
+          <w:p>
+            <w:pPr>
+              <w:spacing w:after="160" w:line="259" w:lineRule="auto"/>
+            </w:pPr>
+            <w:r>
+              <w:t>Is this the total patient contribution?</w:t>
+            </w:r>
+          </w:p>
+        </w:tc>
+      </w:tr>
+      <w:tr>
+        <w:trPr>
+          <w:tblCellSpacing w:w="15" w:type="dxa"/>
+        </w:trPr>
+        <w:tc>
+          <w:tcPr>
+            <w:tcW w:w="2082" w:type="dxa"/>
+            <w:vAlign w:val="center"/>
+            <w:hideMark/>
+          </w:tcPr>
+          <w:p>
+            <w:pPr>
+              <w:spacing w:after="160" w:line="259" w:lineRule="auto"/>
+            </w:pPr>
+            <w:r>
+              <w:t>Total Discount</w:t>
+            </w:r>
+          </w:p>
+        </w:tc>
+        <w:tc>
+          <w:tcPr>
+            <w:tcW w:w="3797" w:type="dxa"/>
+            <w:vAlign w:val="center"/>
+            <w:hideMark/>
+          </w:tcPr>
+          <w:p>
+            <w:pPr>
+              <w:spacing w:after="160" w:line="259" w:lineRule="auto"/>
+            </w:pPr>
+            <w:r>
+              <w:t>Hospital Discount unless manually overridden</w:t>
+            </w:r>
+          </w:p>
+        </w:tc>
+        <w:tc>
+          <w:tcPr>
+            <w:tcW w:w="3027" w:type="dxa"/>
+            <w:vAlign w:val="center"/>
+            <w:hideMark/>
+          </w:tcPr>
+          <w:p>
+            <w:pPr>
+              <w:spacing w:after="160" w:line="259" w:lineRule="auto"/>
+            </w:pPr>
+            <w:r>
+              <w:t>Does total discount include payor and patient discounts?</w:t>
+            </w:r>
+          </w:p>
+        </w:tc>
+      </w:tr>
+      <w:tr>
+        <w:trPr>
+          <w:tblCellSpacing w:w="15" w:type="dxa"/>
+        </w:trPr>
+        <w:tc>
+          <w:tcPr>
+            <w:tcW w:w="2082" w:type="dxa"/>
+            <w:vAlign w:val="center"/>
+            <w:hideMark/>
+          </w:tcPr>
+          <w:p>
+            <w:pPr>
+              <w:spacing w:after="160" w:line="259" w:lineRule="auto"/>
+            </w:pPr>
+            <w:r>
+              <w:t>Payor Net Amount</w:t>
+            </w:r>
+          </w:p>
+        </w:tc>
+        <w:tc>
+          <w:tcPr>
+            <w:tcW w:w="3797" w:type="dxa"/>
+            <w:vAlign w:val="center"/>
+            <w:hideMark/>
+          </w:tcPr>
+          <w:p>
+            <w:pPr>
+              <w:spacing w:after="160" w:line="259" w:lineRule="auto"/>
+            </w:pPr>
+            <w:r>
+              <w:t>Approved Amount − Payor Discount</w:t>
+            </w:r>
+          </w:p>
+        </w:tc>
+        <w:tc>
+          <w:tcPr>
+            <w:tcW w:w="3027" w:type="dxa"/>
+            <w:vAlign w:val="center"/>
+            <w:hideMark/>
+          </w:tcPr>
+          <w:p>
+            <w:pPr>
+              <w:spacing w:after="160" w:line="259" w:lineRule="auto"/>
+            </w:pPr>
+            <w:r>
+              <w:t>Should copay, TDS or disallowance also be deducted?</w:t>
+            </w:r>
+          </w:p>
+        </w:tc>
+      </w:tr>
+      <w:tr>
+        <w:trPr>
+          <w:tblCellSpacing w:w="15" w:type="dxa"/>
+        </w:trPr>
+        <w:tc>
+          <w:tcPr>
+            <w:tcW w:w="2082" w:type="dxa"/>
+            <w:vAlign w:val="center"/>
+            <w:hideMark/>
+          </w:tcPr>
+          <w:p>
+            <w:pPr>
+              <w:spacing w:after="160" w:line="259" w:lineRule="auto"/>
+            </w:pPr>
+            <w:r>
+              <w:t>Patient Net Amount</w:t>
+            </w:r>
+          </w:p>
+        </w:tc>
+        <w:tc>
+          <w:tcPr>
+            <w:tcW w:w="3797" w:type="dxa"/>
+            <w:vAlign w:val="center"/>
+            <w:hideMark/>
+          </w:tcPr>
+          <w:p>
+            <w:pPr>
+              <w:spacing w:after="160" w:line="259" w:lineRule="auto"/>
+            </w:pPr>
+            <w:r>
+              <w:t>Patient Amount − Patient Discount</w:t>
+            </w:r>
+          </w:p>
+        </w:tc>
+        <w:tc>
+          <w:tcPr>
+            <w:tcW w:w="3027" w:type="dxa"/>
+            <w:vAlign w:val="center"/>
+            <w:hideMark/>
+          </w:tcPr>
+          <w:p>
+            <w:pPr>
+              <w:spacing w:after="160" w:line="259" w:lineRule="auto"/>
+            </w:pPr>
+            <w:r>
+              <w:t>Is patient amount before or after discount?</w:t>
+            </w:r>
+          </w:p>
+        </w:tc>
+      </w:tr>
+      <w:tr>
+        <w:trPr>
+          <w:tblCellSpacing w:w="15" w:type="dxa"/>
+        </w:trPr>
+        <w:tc>
+          <w:tcPr>
+            <w:tcW w:w="2082" w:type="dxa"/>
+            <w:vAlign w:val="center"/>
+            <w:hideMark/>
+          </w:tcPr>
+          <w:p>
+            <w:pPr>
+              <w:spacing w:after="160" w:line="259" w:lineRule="auto"/>
+            </w:pPr>
+            <w:r>
+              <w:t>Amount Received</w:t>
+            </w:r>
+          </w:p>
+        </w:tc>
+        <w:tc>
+          <w:tcPr>
+            <w:tcW w:w="3797" w:type="dxa"/>
+            <w:vAlign w:val="center"/>
+            <w:hideMark/>
+          </w:tcPr>
+          <w:p>
+            <w:pPr>
+              <w:spacing w:after="160" w:line="259" w:lineRule="auto"/>
+            </w:pPr>
+            <w:r>
+              <w:t>Settled Amount</w:t>
+            </w:r>
+          </w:p>
+        </w:tc>
+        <w:tc>
+          <w:tcPr>
+            <w:tcW w:w="3027" w:type="dxa"/>
+            <w:vAlign w:val="center"/>
+            <w:hideMark/>
+          </w:tcPr>
+          <w:p>
+            <w:pPr>
+              <w:spacing w:after="160" w:line="259" w:lineRule="auto"/>
+            </w:pPr>
+            <w:r>
+              <w:t>Does this represent actual bank receipt?</w:t>
+            </w:r>
+          </w:p>
+        </w:tc>
+      </w:tr>
+      <w:tr>
+        <w:trPr>
+          <w:tblCellSpacing w:w="15" w:type="dxa"/>
+        </w:trPr>
+        <w:tc>
+          <w:tcPr>
+            <w:tcW w:w="2082" w:type="dxa"/>
+            <w:vAlign w:val="center"/>
+            <w:hideMark/>
+          </w:tcPr>
+          <w:p>
+            <w:pPr>
+              <w:spacing w:after="160" w:line="259" w:lineRule="auto"/>
+            </w:pPr>
+            <w:r>
+              <w:t>Amount Receivable</w:t>
+            </w:r>
+          </w:p>
+        </w:tc>
+        <w:tc>
+          <w:tcPr>
+            <w:tcW w:w="3797" w:type="dxa"/>
+            <w:vAlign w:val="center"/>
+            <w:hideMark/>
+          </w:tcPr>
+          <w:p>
+            <w:pPr>
+              <w:spacing w:after="160" w:line="259" w:lineRule="auto"/>
+            </w:pPr>
+            <w:r>
+              <w:t>Approved − Settled − TDS</w:t>
+            </w:r>
+          </w:p>
+        </w:tc>
+        <w:tc>
+          <w:tcPr>
+            <w:tcW w:w="3027" w:type="dxa"/>
+            <w:vAlign w:val="center"/>
+            <w:hideMark/>
+          </w:tcPr>
+          <w:p>
+            <w:pPr>
+              <w:spacing w:after="160" w:line="259" w:lineRule="auto"/>
+            </w:pPr>
+            <w:r>
+              <w:t>Should TDS reduce outstanding receivable?</w:t>
+            </w:r>
+          </w:p>
+        </w:tc>
+      </w:tr>
+      <w:tr>
+        <w:trPr>
+          <w:tblCellSpacing w:w="15" w:type="dxa"/>
+        </w:trPr>
+        <w:tc>
+          <w:tcPr>
+            <w:tcW w:w="2082" w:type="dxa"/>
+            <w:vAlign w:val="center"/>
+            <w:hideMark/>
+          </w:tcPr>
+          <w:p>
+            <w:pPr>
+              <w:spacing w:after="160" w:line="259" w:lineRule="auto"/>
+            </w:pPr>
+            <w:r>
+              <w:t>Submission Date</w:t>
+            </w:r>
+          </w:p>
+        </w:tc>
+        <w:tc>
+          <w:tcPr>
+            <w:tcW w:w="3797" w:type="dxa"/>
+            <w:vAlign w:val="center"/>
+            <w:hideMark/>
+          </w:tcPr>
+          <w:p>
+            <w:pPr>
+              <w:spacing w:after="160" w:line="259" w:lineRule="auto"/>
+            </w:pPr>
+            <w:r>
+              <w:t>IHX document submission date</w:t>
+            </w:r>
+          </w:p>
+        </w:tc>
+        <w:tc>
+          <w:tcPr>
+            <w:tcW w:w="3027" w:type="dxa"/>
+            <w:vAlign w:val="center"/>
+            <w:hideMark/>
+          </w:tcPr>
+          <w:p>
+            <w:pPr>
+              <w:spacing w:after="160" w:line="259" w:lineRule="auto"/>
+            </w:pPr>
+            <w:r>
+              <w:t>Is this considered dispatch/submission date?</w:t>
+            </w:r>
+          </w:p>
+        </w:tc>
+      </w:tr>
+      <w:tr>
+        <w:trPr>
+          <w:tblCellSpacing w:w="15" w:type="dxa"/>
+        </w:trPr>
+        <w:tc>
+          <w:tcPr>
+            <w:tcW w:w="2082" w:type="dxa"/>
+            <w:vAlign w:val="center"/>
+            <w:hideMark/>
+          </w:tcPr>
+          <w:p>
+            <w:pPr>
+              <w:spacing w:after="160" w:line="259" w:lineRule="auto"/>
+            </w:pPr>
+            <w:r>
+              <w:t>Bill Date</w:t>
+            </w:r>
+          </w:p>
+        </w:tc>
+        <w:tc>
+          <w:tcPr>
+            <w:tcW w:w="3797" w:type="dxa"/>
+            <w:vAlign w:val="center"/>
+            <w:hideMark/>
+          </w:tcPr>
+          <w:p>
+            <w:pPr>
+              <w:spacing w:after="160" w:line="259" w:lineRule="auto"/>
+            </w:pPr>
+            <w:r>
+              <w:t>Manual</w:t>
+            </w:r>
+          </w:p>
+        </w:tc>
+        <w:tc>
+          <w:tcPr>
+            <w:tcW w:w="3027" w:type="dxa"/>
+            <w:vAlign w:val="center"/>
+            <w:hideMark/>
+          </w:tcPr>
+          <w:p>
+            <w:pPr>
+              <w:spacing w:after="160" w:line="259" w:lineRule="auto"/>
+            </w:pPr>
+            <w:r>
+              <w:t>Can it be sourced later from HIS?</w:t>
+            </w:r>
+          </w:p>
+        </w:tc>
+      </w:tr>
+    </w:tbl>
+    <w:p>
+      <w:pPr>
+        <w:spacing w:after="160" w:line="259" w:lineRule="auto"/>
+      </w:pPr>
+    </w:p>
+    <w:p/>
+    <w:p>
+      <w:pPr>
+        <w:rPr>
+          <w:rFonts w:asciiTheme="majorHAnsi" w:eastAsiaTheme="majorEastAsia" w:hAnsiTheme="majorHAnsi" w:cstheme="majorBidi"/>
+          <w:b/>
+          <w:bCs/>
+          <w:color w:val="4F81BD" w:themeColor="accent1"/>
+          <w:sz w:val="26"/>
+          <w:szCs w:val="26"/>
+        </w:rPr>
+      </w:pPr>
+    </w:p>
+    <w:p>
+      <w:pPr>
+        <w:rPr>
+          <w:rFonts w:asciiTheme="majorHAnsi" w:eastAsiaTheme="majorEastAsia" w:hAnsiTheme="majorHAnsi" w:cstheme="majorBidi"/>
+          <w:b/>
+          <w:bCs/>
+          <w:color w:val="4F81BD" w:themeColor="accent1"/>
+          <w:sz w:val="26"/>
+          <w:szCs w:val="26"/>
+        </w:rPr>
+      </w:pPr>
+    </w:p>
     <w:sectPr>
       <w:pgSz w:w="12240" w:h="15840"/>
       <w:pgMar w:top="1440" w:right="1800" w:bottom="1440" w:left="1800" w:header="720" w:footer="720" w:gutter="0"/>
@@ -2776,6 +4803,7 @@
   <w:style w:type="character" w:default="1" w:styleId="DefaultParagraphFont">
     <w:name w:val="Default Paragraph Font"/>
     <w:uiPriority w:val="1"/>
+    <w:semiHidden/>
     <w:unhideWhenUsed/>
   </w:style>
   <w:style w:type="table" w:default="1" w:styleId="TableNormal">

</xml_diff>

<commit_message>
New rule book related changes
</commit_message>
<xml_diff>
--- a/architecture/India_Claims_Automation_Platform_Architecture_and_Project_Context.docx
+++ b/architecture/India_Claims_Automation_Platform_Architecture_and_Project_Context.docx
@@ -46,15 +46,7 @@
     </w:p>
     <w:p>
       <w:r>
-        <w:t xml:space="preserve">Initial: IHX and NHA/CGHS. Future: </w:t>
-      </w:r>
-      <w:proofErr w:type="spellStart"/>
-      <w:r>
-        <w:t>MediAssist</w:t>
-      </w:r>
-      <w:proofErr w:type="spellEnd"/>
-      <w:r>
-        <w:t>, FHPL, Star Health, Future Generali and additional payers.</w:t>
+        <w:t>Initial: IHX and NHA/CGHS. Future: MediAssist, FHPL, Star Health, Future Generali and additional payers.</w:t>
       </w:r>
     </w:p>
     <w:p>
@@ -71,13 +63,8 @@
       </w:r>
       <w:r>
         <w:br/>
-        <w:t xml:space="preserve">Backend: </w:t>
-      </w:r>
-      <w:proofErr w:type="spellStart"/>
-      <w:r>
-        <w:t>FastAPI</w:t>
-      </w:r>
-      <w:proofErr w:type="spellEnd"/>
+        <w:t>Backend: FastAPI</w:t>
+      </w:r>
       <w:r>
         <w:br/>
         <w:t>Automation: Playwright</w:t>
@@ -96,13 +83,8 @@
       </w:r>
       <w:r>
         <w:br/>
-        <w:t xml:space="preserve">DB Tool: </w:t>
-      </w:r>
-      <w:proofErr w:type="spellStart"/>
-      <w:r>
-        <w:t>DBeaver</w:t>
-      </w:r>
-      <w:proofErr w:type="spellEnd"/>
+        <w:t>DB Tool: DBeaver</w:t>
+      </w:r>
     </w:p>
     <w:p>
       <w:pPr>
@@ -114,15 +96,7 @@
     </w:p>
     <w:p>
       <w:r>
-        <w:t xml:space="preserve">ReactJS ↔ </w:t>
-      </w:r>
-      <w:proofErr w:type="spellStart"/>
-      <w:r>
-        <w:t>FastAPI</w:t>
-      </w:r>
-      <w:proofErr w:type="spellEnd"/>
-      <w:r>
-        <w:t xml:space="preserve"> ↔ Services/Connectors ↔ Playwright &amp; Microsoft Graph ↔ PostgreSQL</w:t>
+        <w:t>ReactJS ↔ FastAPI ↔ Services/Connectors ↔ Playwright &amp; Microsoft Graph ↔ PostgreSQL</w:t>
       </w:r>
     </w:p>
     <w:p/>
@@ -344,18 +318,8 @@
                 <w:bCs/>
                 <w:lang w:val="en-IN"/>
               </w:rPr>
-              <w:t xml:space="preserve"> </w:t>
+              <w:t xml:space="preserve"> PortalConnection</w:t>
             </w:r>
-            <w:proofErr w:type="spellStart"/>
-            <w:r>
-              <w:rPr>
-                <w:b/>
-                <w:bCs/>
-                <w:lang w:val="en-IN"/>
-              </w:rPr>
-              <w:t>PortalConnection</w:t>
-            </w:r>
-            <w:proofErr w:type="spellEnd"/>
           </w:p>
         </w:tc>
         <w:tc>
@@ -412,18 +376,8 @@
                 <w:bCs/>
                 <w:lang w:val="en-IN"/>
               </w:rPr>
-              <w:t xml:space="preserve"> </w:t>
+              <w:t xml:space="preserve"> BatchJob</w:t>
             </w:r>
-            <w:proofErr w:type="spellStart"/>
-            <w:r>
-              <w:rPr>
-                <w:b/>
-                <w:bCs/>
-                <w:lang w:val="en-IN"/>
-              </w:rPr>
-              <w:t>BatchJob</w:t>
-            </w:r>
-            <w:proofErr w:type="spellEnd"/>
           </w:p>
         </w:tc>
         <w:tc>
@@ -538,18 +492,8 @@
                 <w:bCs/>
                 <w:lang w:val="en-IN"/>
               </w:rPr>
-              <w:t xml:space="preserve"> </w:t>
+              <w:t xml:space="preserve"> ClaimSummary</w:t>
             </w:r>
-            <w:proofErr w:type="spellStart"/>
-            <w:r>
-              <w:rPr>
-                <w:b/>
-                <w:bCs/>
-                <w:lang w:val="en-IN"/>
-              </w:rPr>
-              <w:t>ClaimSummary</w:t>
-            </w:r>
-            <w:proofErr w:type="spellEnd"/>
           </w:p>
         </w:tc>
         <w:tc>
@@ -606,18 +550,8 @@
                 <w:bCs/>
                 <w:lang w:val="en-IN"/>
               </w:rPr>
-              <w:t xml:space="preserve"> </w:t>
+              <w:t xml:space="preserve"> ClaimDetail</w:t>
             </w:r>
-            <w:proofErr w:type="spellStart"/>
-            <w:r>
-              <w:rPr>
-                <w:b/>
-                <w:bCs/>
-                <w:lang w:val="en-IN"/>
-              </w:rPr>
-              <w:t>ClaimDetail</w:t>
-            </w:r>
-            <w:proofErr w:type="spellEnd"/>
           </w:p>
         </w:tc>
         <w:tc>
@@ -712,15 +646,7 @@
     </w:p>
     <w:p>
       <w:r>
-        <w:t xml:space="preserve">Separation of concerns, connector-based design, configuration-driven development, reusable services, </w:t>
-      </w:r>
-      <w:proofErr w:type="spellStart"/>
-      <w:r>
-        <w:t>SQLAlchemy</w:t>
-      </w:r>
-      <w:proofErr w:type="spellEnd"/>
-      <w:r>
-        <w:t xml:space="preserve"> ORM, minimal logic in main.py.</w:t>
+        <w:t>Separation of concerns, connector-based design, configuration-driven development, reusable services, SQLAlchemy ORM, minimal logic in main.py.</w:t>
       </w:r>
     </w:p>
     <w:p>
@@ -733,36 +659,7 @@
     </w:p>
     <w:p>
       <w:r>
-        <w:t>app/{</w:t>
-      </w:r>
-      <w:proofErr w:type="spellStart"/>
-      <w:proofErr w:type="gramStart"/>
-      <w:r>
-        <w:t>api,connectors</w:t>
-      </w:r>
-      <w:proofErr w:type="gramEnd"/>
-      <w:r>
-        <w:t>,</w:t>
-      </w:r>
-      <w:proofErr w:type="gramStart"/>
-      <w:r>
-        <w:t>graph,models</w:t>
-      </w:r>
-      <w:proofErr w:type="gramEnd"/>
-      <w:r>
-        <w:t>,</w:t>
-      </w:r>
-      <w:proofErr w:type="gramStart"/>
-      <w:r>
-        <w:t>reports,scheduler</w:t>
-      </w:r>
-      <w:proofErr w:type="gramEnd"/>
-      <w:r>
-        <w:t>,services</w:t>
-      </w:r>
-      <w:proofErr w:type="spellEnd"/>
-      <w:r>
-        <w:t>}, config.py, database.py, main.py</w:t>
+        <w:t>app/{api,connectors,graph,models,reports,scheduler,services}, config.py, database.py, main.py</w:t>
       </w:r>
     </w:p>
     <w:p>
@@ -775,39 +672,7 @@
     </w:p>
     <w:p>
       <w:r>
-        <w:t xml:space="preserve">Portal → </w:t>
-      </w:r>
-      <w:proofErr w:type="spellStart"/>
-      <w:r>
-        <w:t>PortalConnection</w:t>
-      </w:r>
-      <w:proofErr w:type="spellEnd"/>
-      <w:r>
-        <w:t xml:space="preserve"> → </w:t>
-      </w:r>
-      <w:proofErr w:type="spellStart"/>
-      <w:r>
-        <w:t>BatchJob</w:t>
-      </w:r>
-      <w:proofErr w:type="spellEnd"/>
-      <w:r>
-        <w:t xml:space="preserve"> → Execution → </w:t>
-      </w:r>
-      <w:proofErr w:type="spellStart"/>
-      <w:r>
-        <w:t>ClaimSummary</w:t>
-      </w:r>
-      <w:proofErr w:type="spellEnd"/>
-      <w:r>
-        <w:t xml:space="preserve"> → </w:t>
-      </w:r>
-      <w:proofErr w:type="spellStart"/>
-      <w:r>
-        <w:t>ClaimDetail</w:t>
-      </w:r>
-      <w:proofErr w:type="spellEnd"/>
-      <w:r>
-        <w:t xml:space="preserve"> → Documents</w:t>
+        <w:t>Portal → PortalConnection → BatchJob → Execution → ClaimSummary → ClaimDetail → Documents</w:t>
       </w:r>
     </w:p>
     <w:p>
@@ -833,15 +698,7 @@
     </w:p>
     <w:p>
       <w:r>
-        <w:t xml:space="preserve">PostgreSQL + </w:t>
-      </w:r>
-      <w:proofErr w:type="spellStart"/>
-      <w:r>
-        <w:t>SQLAlchemy</w:t>
-      </w:r>
-      <w:proofErr w:type="spellEnd"/>
-      <w:r>
-        <w:t xml:space="preserve"> ORM. Models are the source of truth; schema generated from models.</w:t>
+        <w:t>PostgreSQL + SQLAlchemy ORM. Models are the source of truth; schema generated from models.</w:t>
       </w:r>
     </w:p>
     <w:p>
@@ -849,33 +706,12 @@
         <w:pStyle w:val="Heading2"/>
       </w:pPr>
       <w:r>
-        <w:t xml:space="preserve">10. Portal &amp; </w:t>
-      </w:r>
-      <w:proofErr w:type="spellStart"/>
-      <w:r>
-        <w:t>PortalConnection</w:t>
-      </w:r>
-      <w:proofErr w:type="spellEnd"/>
+        <w:t>10. Portal &amp; PortalConnection</w:t>
+      </w:r>
     </w:p>
     <w:p>
       <w:r>
-        <w:t xml:space="preserve">Portal represents an external payer. </w:t>
-      </w:r>
-      <w:proofErr w:type="spellStart"/>
-      <w:r>
-        <w:t>PortalConnection</w:t>
-      </w:r>
-      <w:proofErr w:type="spellEnd"/>
-      <w:r>
-        <w:t xml:space="preserve"> represents one hospital/customer login. Relationship: Portal (1) to </w:t>
-      </w:r>
-      <w:proofErr w:type="spellStart"/>
-      <w:r>
-        <w:t>PortalConnection</w:t>
-      </w:r>
-      <w:proofErr w:type="spellEnd"/>
-      <w:r>
-        <w:t xml:space="preserve"> (many).</w:t>
+        <w:t>Portal represents an external payer. PortalConnection represents one hospital/customer login. Relationship: Portal (1) to PortalConnection (many).</w:t>
       </w:r>
     </w:p>
     <w:p>
@@ -940,31 +776,7 @@
     </w:p>
     <w:p>
       <w:r>
-        <w:t xml:space="preserve">Completed: project skeleton, </w:t>
-      </w:r>
-      <w:proofErr w:type="spellStart"/>
-      <w:r>
-        <w:t>FastAPI</w:t>
-      </w:r>
-      <w:proofErr w:type="spellEnd"/>
-      <w:r>
-        <w:t xml:space="preserve">, config, PostgreSQL connectivity, </w:t>
-      </w:r>
-      <w:proofErr w:type="spellStart"/>
-      <w:r>
-        <w:t>SQLAlchemy</w:t>
-      </w:r>
-      <w:proofErr w:type="spellEnd"/>
-      <w:r>
-        <w:t xml:space="preserve"> base, health endpoint, Portal model. Current: </w:t>
-      </w:r>
-      <w:proofErr w:type="spellStart"/>
-      <w:r>
-        <w:t>PortalConnection</w:t>
-      </w:r>
-      <w:proofErr w:type="spellEnd"/>
-      <w:r>
-        <w:t>.</w:t>
+        <w:t>Completed: project skeleton, FastAPI, config, PostgreSQL connectivity, SQLAlchemy base, health endpoint, Portal model. Current: PortalConnection.</w:t>
       </w:r>
     </w:p>
     <w:p>
@@ -1026,7 +838,6 @@
           <w:szCs w:val="26"/>
         </w:rPr>
       </w:pPr>
-      <w:proofErr w:type="spellStart"/>
       <w:r>
         <w:rPr>
           <w:rFonts w:asciiTheme="majorHAnsi" w:eastAsiaTheme="majorEastAsia" w:hAnsiTheme="majorHAnsi" w:cstheme="majorBidi"/>
@@ -1036,19 +847,7 @@
           <w:sz w:val="26"/>
           <w:szCs w:val="26"/>
         </w:rPr>
-        <w:t>india</w:t>
-      </w:r>
-      <w:proofErr w:type="spellEnd"/>
-      <w:r>
-        <w:rPr>
-          <w:rFonts w:asciiTheme="majorHAnsi" w:eastAsiaTheme="majorEastAsia" w:hAnsiTheme="majorHAnsi" w:cstheme="majorBidi"/>
-          <w:b/>
-          <w:bCs/>
-          <w:color w:val="4F81BD" w:themeColor="accent1"/>
-          <w:sz w:val="26"/>
-          <w:szCs w:val="26"/>
-        </w:rPr>
-        <w:t>-claims-automation/</w:t>
+        <w:t>india-claims-automation/</w:t>
       </w:r>
     </w:p>
     <w:p>
@@ -1850,7 +1649,6 @@
           <w:szCs w:val="26"/>
         </w:rPr>
       </w:pPr>
-      <w:proofErr w:type="gramStart"/>
       <w:r>
         <w:rPr>
           <w:rFonts w:asciiTheme="majorHAnsi" w:eastAsiaTheme="majorEastAsia" w:hAnsiTheme="majorHAnsi" w:cstheme="majorBidi"/>
@@ -1860,10 +1658,11 @@
           <w:sz w:val="26"/>
           <w:szCs w:val="26"/>
         </w:rPr>
-        <w:t>Components</w:t>
-      </w:r>
-      <w:proofErr w:type="gramEnd"/>
-      <w:r>
+        <w:t>Components purpose:</w:t>
+      </w:r>
+    </w:p>
+    <w:p>
+      <w:pPr>
         <w:rPr>
           <w:rFonts w:asciiTheme="majorHAnsi" w:eastAsiaTheme="majorEastAsia" w:hAnsiTheme="majorHAnsi" w:cstheme="majorBidi"/>
           <w:b/>
@@ -1872,11 +1671,8 @@
           <w:sz w:val="26"/>
           <w:szCs w:val="26"/>
         </w:rPr>
-        <w:t xml:space="preserve"> purpose:</w:t>
-      </w:r>
-    </w:p>
-    <w:p>
-      <w:pPr>
+      </w:pPr>
+      <w:r>
         <w:rPr>
           <w:rFonts w:asciiTheme="majorHAnsi" w:eastAsiaTheme="majorEastAsia" w:hAnsiTheme="majorHAnsi" w:cstheme="majorBidi"/>
           <w:b/>
@@ -1885,30 +1681,7 @@
           <w:sz w:val="26"/>
           <w:szCs w:val="26"/>
         </w:rPr>
-      </w:pPr>
-      <w:proofErr w:type="gramStart"/>
-      <w:r>
-        <w:rPr>
-          <w:rFonts w:asciiTheme="majorHAnsi" w:eastAsiaTheme="majorEastAsia" w:hAnsiTheme="majorHAnsi" w:cstheme="majorBidi"/>
-          <w:b/>
-          <w:bCs/>
-          <w:color w:val="4F81BD" w:themeColor="accent1"/>
-          <w:sz w:val="26"/>
-          <w:szCs w:val="26"/>
-        </w:rPr>
-        <w:t>ihx_connector.py  -</w:t>
-      </w:r>
-      <w:proofErr w:type="gramEnd"/>
-      <w:r>
-        <w:rPr>
-          <w:rFonts w:asciiTheme="majorHAnsi" w:eastAsiaTheme="majorEastAsia" w:hAnsiTheme="majorHAnsi" w:cstheme="majorBidi"/>
-          <w:b/>
-          <w:bCs/>
-          <w:color w:val="4F81BD" w:themeColor="accent1"/>
-          <w:sz w:val="26"/>
-          <w:szCs w:val="26"/>
-        </w:rPr>
-        <w:t>&gt; login, OTP, table scraping</w:t>
+        <w:t>ihx_connector.py  -&gt; login, OTP, table scraping</w:t>
       </w:r>
     </w:p>
     <w:p>
@@ -1932,21 +1705,8 @@
           <w:szCs w:val="26"/>
         </w:rPr>
         <w:lastRenderedPageBreak/>
-        <w:t xml:space="preserve">ihx_router.py     -&gt; manual API trigger from </w:t>
-      </w:r>
-      <w:proofErr w:type="spellStart"/>
-      <w:r>
-        <w:rPr>
-          <w:rFonts w:asciiTheme="majorHAnsi" w:eastAsiaTheme="majorEastAsia" w:hAnsiTheme="majorHAnsi" w:cstheme="majorBidi"/>
-          <w:b/>
-          <w:bCs/>
-          <w:color w:val="4F81BD" w:themeColor="accent1"/>
-          <w:sz w:val="26"/>
-          <w:szCs w:val="26"/>
-        </w:rPr>
-        <w:t>FastAPI</w:t>
-      </w:r>
-      <w:proofErr w:type="spellEnd"/>
+        <w:t>ihx_router.py     -&gt; manual API trigger from FastAPI</w:t>
+      </w:r>
     </w:p>
     <w:p>
       <w:pPr>
@@ -2073,11 +1833,9 @@
             <w:pPr>
               <w:spacing w:after="160" w:line="259" w:lineRule="auto"/>
             </w:pPr>
-            <w:proofErr w:type="spellStart"/>
             <w:r>
               <w:t>admissionNumber</w:t>
             </w:r>
-            <w:proofErr w:type="spellEnd"/>
           </w:p>
         </w:tc>
         <w:tc>
@@ -2090,11 +1848,9 @@
             <w:pPr>
               <w:spacing w:after="160" w:line="259" w:lineRule="auto"/>
             </w:pPr>
-            <w:proofErr w:type="spellStart"/>
             <w:r>
               <w:t>in_patient_number</w:t>
             </w:r>
-            <w:proofErr w:type="spellEnd"/>
           </w:p>
         </w:tc>
       </w:tr>
@@ -2112,11 +1868,9 @@
             <w:pPr>
               <w:spacing w:after="160" w:line="259" w:lineRule="auto"/>
             </w:pPr>
-            <w:proofErr w:type="spellStart"/>
             <w:r>
               <w:t>admittedDate</w:t>
             </w:r>
-            <w:proofErr w:type="spellEnd"/>
           </w:p>
         </w:tc>
         <w:tc>
@@ -2129,11 +1883,9 @@
             <w:pPr>
               <w:spacing w:after="160" w:line="259" w:lineRule="auto"/>
             </w:pPr>
-            <w:proofErr w:type="spellStart"/>
             <w:r>
               <w:t>date_of_admission</w:t>
             </w:r>
-            <w:proofErr w:type="spellEnd"/>
           </w:p>
         </w:tc>
       </w:tr>
@@ -2151,11 +1903,9 @@
             <w:pPr>
               <w:spacing w:after="160" w:line="259" w:lineRule="auto"/>
             </w:pPr>
-            <w:proofErr w:type="spellStart"/>
             <w:r>
               <w:t>dischargedDate</w:t>
             </w:r>
-            <w:proofErr w:type="spellEnd"/>
           </w:p>
         </w:tc>
         <w:tc>
@@ -2168,11 +1918,9 @@
             <w:pPr>
               <w:spacing w:after="160" w:line="259" w:lineRule="auto"/>
             </w:pPr>
-            <w:proofErr w:type="spellStart"/>
             <w:r>
               <w:t>date_of_discharge</w:t>
             </w:r>
-            <w:proofErr w:type="spellEnd"/>
           </w:p>
         </w:tc>
       </w:tr>
@@ -2190,11 +1938,9 @@
             <w:pPr>
               <w:spacing w:after="160" w:line="259" w:lineRule="auto"/>
             </w:pPr>
-            <w:proofErr w:type="spellStart"/>
             <w:r>
               <w:t>insuranceCompany</w:t>
             </w:r>
-            <w:proofErr w:type="spellEnd"/>
           </w:p>
         </w:tc>
         <w:tc>
@@ -2207,11 +1953,9 @@
             <w:pPr>
               <w:spacing w:after="160" w:line="259" w:lineRule="auto"/>
             </w:pPr>
-            <w:proofErr w:type="spellStart"/>
             <w:r>
               <w:t>insurance_company_name</w:t>
             </w:r>
-            <w:proofErr w:type="spellEnd"/>
           </w:p>
         </w:tc>
       </w:tr>
@@ -2229,11 +1973,9 @@
             <w:pPr>
               <w:spacing w:after="160" w:line="259" w:lineRule="auto"/>
             </w:pPr>
-            <w:proofErr w:type="spellStart"/>
             <w:r>
               <w:t>payorCompanyName</w:t>
             </w:r>
-            <w:proofErr w:type="spellEnd"/>
           </w:p>
         </w:tc>
         <w:tc>
@@ -2246,11 +1988,9 @@
             <w:pPr>
               <w:spacing w:after="160" w:line="259" w:lineRule="auto"/>
             </w:pPr>
-            <w:proofErr w:type="spellStart"/>
             <w:r>
               <w:t>tpa_name</w:t>
             </w:r>
-            <w:proofErr w:type="spellEnd"/>
           </w:p>
         </w:tc>
       </w:tr>
@@ -2268,11 +2008,9 @@
             <w:pPr>
               <w:spacing w:after="160" w:line="259" w:lineRule="auto"/>
             </w:pPr>
-            <w:proofErr w:type="spellStart"/>
             <w:r>
               <w:t>claimAuthNumber</w:t>
             </w:r>
-            <w:proofErr w:type="spellEnd"/>
           </w:p>
         </w:tc>
         <w:tc>
@@ -2285,11 +2023,9 @@
             <w:pPr>
               <w:spacing w:after="160" w:line="259" w:lineRule="auto"/>
             </w:pPr>
-            <w:proofErr w:type="spellStart"/>
             <w:r>
               <w:t>claim_number</w:t>
             </w:r>
-            <w:proofErr w:type="spellEnd"/>
           </w:p>
         </w:tc>
       </w:tr>
@@ -2307,11 +2043,9 @@
             <w:pPr>
               <w:spacing w:after="160" w:line="259" w:lineRule="auto"/>
             </w:pPr>
-            <w:proofErr w:type="spellStart"/>
             <w:r>
               <w:t>billNumber</w:t>
             </w:r>
-            <w:proofErr w:type="spellEnd"/>
           </w:p>
         </w:tc>
         <w:tc>
@@ -2324,11 +2058,9 @@
             <w:pPr>
               <w:spacing w:after="160" w:line="259" w:lineRule="auto"/>
             </w:pPr>
-            <w:proofErr w:type="spellStart"/>
             <w:r>
               <w:t>invoice_number</w:t>
             </w:r>
-            <w:proofErr w:type="spellEnd"/>
           </w:p>
         </w:tc>
       </w:tr>
@@ -2346,11 +2078,9 @@
             <w:pPr>
               <w:spacing w:after="160" w:line="259" w:lineRule="auto"/>
             </w:pPr>
-            <w:proofErr w:type="spellStart"/>
             <w:r>
               <w:t>billAmount</w:t>
             </w:r>
-            <w:proofErr w:type="spellEnd"/>
           </w:p>
         </w:tc>
         <w:tc>
@@ -2363,11 +2093,9 @@
             <w:pPr>
               <w:spacing w:after="160" w:line="259" w:lineRule="auto"/>
             </w:pPr>
-            <w:proofErr w:type="spellStart"/>
             <w:r>
               <w:t>claimed_amount</w:t>
             </w:r>
-            <w:proofErr w:type="spellEnd"/>
           </w:p>
         </w:tc>
       </w:tr>
@@ -2385,11 +2113,9 @@
             <w:pPr>
               <w:spacing w:after="160" w:line="259" w:lineRule="auto"/>
             </w:pPr>
-            <w:proofErr w:type="spellStart"/>
             <w:r>
               <w:t>payorAmount</w:t>
             </w:r>
-            <w:proofErr w:type="spellEnd"/>
           </w:p>
         </w:tc>
         <w:tc>
@@ -2402,11 +2128,9 @@
             <w:pPr>
               <w:spacing w:after="160" w:line="259" w:lineRule="auto"/>
             </w:pPr>
-            <w:proofErr w:type="spellStart"/>
             <w:r>
               <w:t>approved_amount</w:t>
             </w:r>
-            <w:proofErr w:type="spellEnd"/>
           </w:p>
         </w:tc>
       </w:tr>
@@ -2424,11 +2148,9 @@
             <w:pPr>
               <w:spacing w:after="160" w:line="259" w:lineRule="auto"/>
             </w:pPr>
-            <w:proofErr w:type="spellStart"/>
             <w:r>
               <w:t>patientAmount</w:t>
             </w:r>
-            <w:proofErr w:type="spellEnd"/>
           </w:p>
         </w:tc>
         <w:tc>
@@ -2441,11 +2163,9 @@
             <w:pPr>
               <w:spacing w:after="160" w:line="259" w:lineRule="auto"/>
             </w:pPr>
-            <w:proofErr w:type="spellStart"/>
             <w:r>
               <w:t>patient_paid_amount</w:t>
             </w:r>
-            <w:proofErr w:type="spellEnd"/>
           </w:p>
         </w:tc>
       </w:tr>
@@ -2463,11 +2183,9 @@
             <w:pPr>
               <w:spacing w:after="160" w:line="259" w:lineRule="auto"/>
             </w:pPr>
-            <w:proofErr w:type="spellStart"/>
             <w:r>
               <w:t>amountReceived</w:t>
             </w:r>
-            <w:proofErr w:type="spellEnd"/>
           </w:p>
         </w:tc>
         <w:tc>
@@ -2480,11 +2198,9 @@
             <w:pPr>
               <w:spacing w:after="160" w:line="259" w:lineRule="auto"/>
             </w:pPr>
-            <w:proofErr w:type="spellStart"/>
             <w:r>
               <w:t>settled_amount</w:t>
             </w:r>
-            <w:proofErr w:type="spellEnd"/>
           </w:p>
         </w:tc>
       </w:tr>
@@ -2502,11 +2218,9 @@
             <w:pPr>
               <w:spacing w:after="160" w:line="259" w:lineRule="auto"/>
             </w:pPr>
-            <w:proofErr w:type="spellStart"/>
             <w:r>
               <w:t>tds</w:t>
             </w:r>
-            <w:proofErr w:type="spellEnd"/>
           </w:p>
         </w:tc>
         <w:tc>
@@ -2519,11 +2233,9 @@
             <w:pPr>
               <w:spacing w:after="160" w:line="259" w:lineRule="auto"/>
             </w:pPr>
-            <w:proofErr w:type="spellStart"/>
             <w:r>
               <w:t>tds_amount</w:t>
             </w:r>
-            <w:proofErr w:type="spellEnd"/>
           </w:p>
         </w:tc>
       </w:tr>
@@ -2541,11 +2253,9 @@
             <w:pPr>
               <w:spacing w:after="160" w:line="259" w:lineRule="auto"/>
             </w:pPr>
-            <w:proofErr w:type="spellStart"/>
             <w:r>
               <w:t>submissionDate</w:t>
             </w:r>
-            <w:proofErr w:type="spellEnd"/>
           </w:p>
         </w:tc>
         <w:tc>
@@ -2558,11 +2268,9 @@
             <w:pPr>
               <w:spacing w:after="160" w:line="259" w:lineRule="auto"/>
             </w:pPr>
-            <w:proofErr w:type="spellStart"/>
             <w:r>
               <w:t>document_submission_date</w:t>
             </w:r>
-            <w:proofErr w:type="spellEnd"/>
           </w:p>
         </w:tc>
       </w:tr>
@@ -2580,11 +2288,9 @@
             <w:pPr>
               <w:spacing w:after="160" w:line="259" w:lineRule="auto"/>
             </w:pPr>
-            <w:proofErr w:type="spellStart"/>
             <w:r>
               <w:t>utrChequeNumber</w:t>
             </w:r>
-            <w:proofErr w:type="spellEnd"/>
           </w:p>
         </w:tc>
         <w:tc>
@@ -2597,11 +2303,9 @@
             <w:pPr>
               <w:spacing w:after="160" w:line="259" w:lineRule="auto"/>
             </w:pPr>
-            <w:proofErr w:type="spellStart"/>
             <w:r>
               <w:t>cheque_neft_utr_number</w:t>
             </w:r>
-            <w:proofErr w:type="spellEnd"/>
           </w:p>
         </w:tc>
       </w:tr>
@@ -2619,11 +2323,9 @@
             <w:pPr>
               <w:spacing w:after="160" w:line="259" w:lineRule="auto"/>
             </w:pPr>
-            <w:proofErr w:type="spellStart"/>
             <w:r>
               <w:t>utrChequeDate</w:t>
             </w:r>
-            <w:proofErr w:type="spellEnd"/>
           </w:p>
         </w:tc>
         <w:tc>
@@ -2636,11 +2338,9 @@
             <w:pPr>
               <w:spacing w:after="160" w:line="259" w:lineRule="auto"/>
             </w:pPr>
-            <w:proofErr w:type="spellStart"/>
             <w:r>
               <w:t>cheque_neft_utr_date</w:t>
             </w:r>
-            <w:proofErr w:type="spellEnd"/>
           </w:p>
         </w:tc>
       </w:tr>
@@ -2750,13 +2450,8 @@
       <w:pPr>
         <w:spacing w:after="160" w:line="259" w:lineRule="auto"/>
       </w:pPr>
-      <w:proofErr w:type="spellStart"/>
-      <w:r>
-        <w:t>totalDiscountAmount</w:t>
-      </w:r>
-      <w:proofErr w:type="spellEnd"/>
-      <w:r>
-        <w:t xml:space="preserve"> = manual total discount override</w:t>
+      <w:r>
+        <w:t>totalDiscountAmount = manual total discount override</w:t>
       </w:r>
     </w:p>
     <w:p>
@@ -2764,13 +2459,8 @@
         <w:spacing w:after="160" w:line="259" w:lineRule="auto"/>
       </w:pPr>
       <w:r>
-        <w:t xml:space="preserve">                      OR </w:t>
-      </w:r>
-      <w:proofErr w:type="spellStart"/>
-      <w:r>
-        <w:t>hospitalDiscount</w:t>
-      </w:r>
-      <w:proofErr w:type="spellEnd"/>
+        <w:t xml:space="preserve">                      OR hospitalDiscount</w:t>
+      </w:r>
     </w:p>
     <w:p>
       <w:pPr>
@@ -2890,61 +2580,25 @@
       <w:pPr>
         <w:spacing w:after="160" w:line="259" w:lineRule="auto"/>
       </w:pPr>
-      <w:proofErr w:type="spellStart"/>
-      <w:r>
-        <w:t>payorNetAmount</w:t>
-      </w:r>
-      <w:proofErr w:type="spellEnd"/>
-      <w:r>
-        <w:t xml:space="preserve"> = </w:t>
-      </w:r>
-      <w:proofErr w:type="spellStart"/>
-      <w:r>
-        <w:t>approvedAmount</w:t>
-      </w:r>
-      <w:proofErr w:type="spellEnd"/>
-      <w:r>
-        <w:t xml:space="preserve"> - </w:t>
-      </w:r>
-      <w:proofErr w:type="spellStart"/>
-      <w:r>
-        <w:t>payorDiscount</w:t>
-      </w:r>
-      <w:proofErr w:type="spellEnd"/>
+      <w:r>
+        <w:t>payorNetAmount = approvedAmount - payorDiscount</w:t>
+      </w:r>
     </w:p>
     <w:p>
       <w:pPr>
         <w:spacing w:after="160" w:line="259" w:lineRule="auto"/>
       </w:pPr>
       <w:r>
-        <w:t xml:space="preserve">When </w:t>
-      </w:r>
-      <w:proofErr w:type="spellStart"/>
-      <w:r>
-        <w:t>payorDiscount</w:t>
-      </w:r>
-      <w:proofErr w:type="spellEnd"/>
-      <w:r>
-        <w:t xml:space="preserve"> is blank, it is treated as zero:</w:t>
+        <w:t>When payorDiscount is blank, it is treated as zero:</w:t>
       </w:r>
     </w:p>
     <w:p>
       <w:pPr>
         <w:spacing w:after="160" w:line="259" w:lineRule="auto"/>
       </w:pPr>
-      <w:proofErr w:type="spellStart"/>
-      <w:r>
-        <w:t>payorNetAmount</w:t>
-      </w:r>
-      <w:proofErr w:type="spellEnd"/>
-      <w:r>
-        <w:t xml:space="preserve"> = </w:t>
-      </w:r>
-      <w:proofErr w:type="spellStart"/>
-      <w:r>
-        <w:t>approvedAmount</w:t>
-      </w:r>
-      <w:proofErr w:type="spellEnd"/>
+      <w:r>
+        <w:t>payorNetAmount = approvedAmount</w:t>
+      </w:r>
     </w:p>
     <w:p>
       <w:pPr>
@@ -3033,61 +2687,25 @@
       <w:pPr>
         <w:spacing w:after="160" w:line="259" w:lineRule="auto"/>
       </w:pPr>
-      <w:proofErr w:type="spellStart"/>
-      <w:r>
-        <w:t>patientNetAmount</w:t>
-      </w:r>
-      <w:proofErr w:type="spellEnd"/>
-      <w:r>
-        <w:t xml:space="preserve"> = </w:t>
-      </w:r>
-      <w:proofErr w:type="spellStart"/>
-      <w:r>
-        <w:t>patientAmount</w:t>
-      </w:r>
-      <w:proofErr w:type="spellEnd"/>
-      <w:r>
-        <w:t xml:space="preserve"> - </w:t>
-      </w:r>
-      <w:proofErr w:type="spellStart"/>
-      <w:r>
-        <w:t>patientDiscount</w:t>
-      </w:r>
-      <w:proofErr w:type="spellEnd"/>
+      <w:r>
+        <w:t>patientNetAmount = patientAmount - patientDiscount</w:t>
+      </w:r>
     </w:p>
     <w:p>
       <w:pPr>
         <w:spacing w:after="160" w:line="259" w:lineRule="auto"/>
       </w:pPr>
       <w:r>
-        <w:t xml:space="preserve">When </w:t>
-      </w:r>
-      <w:proofErr w:type="spellStart"/>
-      <w:r>
-        <w:t>patientDiscount</w:t>
-      </w:r>
-      <w:proofErr w:type="spellEnd"/>
-      <w:r>
-        <w:t xml:space="preserve"> is blank:</w:t>
+        <w:t>When patientDiscount is blank:</w:t>
       </w:r>
     </w:p>
     <w:p>
       <w:pPr>
         <w:spacing w:after="160" w:line="259" w:lineRule="auto"/>
       </w:pPr>
-      <w:proofErr w:type="spellStart"/>
-      <w:r>
-        <w:t>patientNetAmount</w:t>
-      </w:r>
-      <w:proofErr w:type="spellEnd"/>
-      <w:r>
-        <w:t xml:space="preserve"> = </w:t>
-      </w:r>
-      <w:proofErr w:type="spellStart"/>
-      <w:r>
-        <w:t>patientAmount</w:t>
-      </w:r>
-      <w:proofErr w:type="spellEnd"/>
+      <w:r>
+        <w:t>patientNetAmount = patientAmount</w:t>
+      </w:r>
     </w:p>
     <w:p>
       <w:pPr>
@@ -3175,47 +2793,27 @@
       <w:pPr>
         <w:spacing w:after="160" w:line="259" w:lineRule="auto"/>
       </w:pPr>
-      <w:proofErr w:type="spellStart"/>
-      <w:r>
-        <w:t>amountReceivable</w:t>
-      </w:r>
-      <w:proofErr w:type="spellEnd"/>
-      <w:r>
-        <w:t xml:space="preserve"> =</w:t>
+      <w:r>
+        <w:t>amountReceivable =</w:t>
       </w:r>
       <w:r>
         <w:t xml:space="preserve"> </w:t>
       </w:r>
       <w:r>
-        <w:t xml:space="preserve">    </w:t>
-      </w:r>
-      <w:proofErr w:type="spellStart"/>
-      <w:r>
-        <w:t>approvedAmount</w:t>
-      </w:r>
-      <w:proofErr w:type="spellEnd"/>
+        <w:t xml:space="preserve">    approvedAmount</w:t>
+      </w:r>
       <w:r>
         <w:t xml:space="preserve"> </w:t>
       </w:r>
       <w:r>
-        <w:t xml:space="preserve">    - </w:t>
-      </w:r>
-      <w:proofErr w:type="spellStart"/>
-      <w:r>
-        <w:t>amountReceived</w:t>
-      </w:r>
-      <w:proofErr w:type="spellEnd"/>
+        <w:t xml:space="preserve">    - amountReceived</w:t>
+      </w:r>
       <w:r>
         <w:t xml:space="preserve"> </w:t>
       </w:r>
       <w:r>
-        <w:t xml:space="preserve">    - </w:t>
-      </w:r>
-      <w:proofErr w:type="spellStart"/>
-      <w:r>
-        <w:t>tds</w:t>
-      </w:r>
-      <w:proofErr w:type="spellEnd"/>
+        <w:t xml:space="preserve">    - tds</w:t>
+      </w:r>
     </w:p>
     <w:p>
       <w:pPr>
@@ -3238,15 +2836,7 @@
         <w:spacing w:after="160" w:line="259" w:lineRule="auto"/>
       </w:pPr>
       <w:r>
-        <w:t xml:space="preserve">Settled </w:t>
-      </w:r>
-      <w:proofErr w:type="gramStart"/>
-      <w:r>
-        <w:t>Amount  =</w:t>
-      </w:r>
-      <w:proofErr w:type="gramEnd"/>
-      <w:r>
-        <w:t xml:space="preserve"> 85,000</w:t>
+        <w:t>Settled Amount  = 85,000</w:t>
       </w:r>
     </w:p>
     <w:p>
@@ -3282,36 +2872,21 @@
       <w:pPr>
         <w:spacing w:after="160" w:line="259" w:lineRule="auto"/>
       </w:pPr>
-      <w:proofErr w:type="spellStart"/>
-      <w:r>
-        <w:t>amountReceivable</w:t>
-      </w:r>
-      <w:proofErr w:type="spellEnd"/>
-      <w:r>
-        <w:t xml:space="preserve"> =</w:t>
+      <w:r>
+        <w:t>amountReceivable =</w:t>
       </w:r>
       <w:r>
         <w:t xml:space="preserve"> </w:t>
       </w:r>
       <w:r>
-        <w:t xml:space="preserve">    </w:t>
-      </w:r>
-      <w:proofErr w:type="spellStart"/>
-      <w:r>
-        <w:t>approvedAmount</w:t>
-      </w:r>
-      <w:proofErr w:type="spellEnd"/>
+        <w:t xml:space="preserve">    approvedAmount</w:t>
+      </w:r>
       <w:r>
         <w:t xml:space="preserve"> </w:t>
       </w:r>
       <w:r>
-        <w:t xml:space="preserve">    - </w:t>
-      </w:r>
-      <w:proofErr w:type="spellStart"/>
-      <w:r>
-        <w:t>amountReceived</w:t>
-      </w:r>
-      <w:proofErr w:type="spellEnd"/>
+        <w:t xml:space="preserve">    - amountReceived</w:t>
+      </w:r>
     </w:p>
     <w:p>
       <w:r>
@@ -3412,23 +2987,7 @@
                 <w:b/>
                 <w:bCs/>
               </w:rPr>
-              <w:t xml:space="preserve">Current </w:t>
-            </w:r>
-            <w:proofErr w:type="spellStart"/>
-            <w:r>
-              <w:rPr>
-                <w:b/>
-                <w:bCs/>
-              </w:rPr>
-              <w:t>ClaimsBridge</w:t>
-            </w:r>
-            <w:proofErr w:type="spellEnd"/>
-            <w:r>
-              <w:rPr>
-                <w:b/>
-                <w:bCs/>
-              </w:rPr>
-              <w:t xml:space="preserve"> logic</w:t>
+              <w:t>Current ClaimsBridge logic</w:t>
             </w:r>
           </w:p>
         </w:tc>
@@ -3974,9 +3533,7 @@
           <w:szCs w:val="26"/>
         </w:rPr>
       </w:pPr>
-    </w:p>
-    <w:p>
-      <w:pPr>
+      <w:r>
         <w:rPr>
           <w:rFonts w:asciiTheme="majorHAnsi" w:eastAsiaTheme="majorEastAsia" w:hAnsiTheme="majorHAnsi" w:cstheme="majorBidi"/>
           <w:b/>
@@ -3985,7 +3542,319 @@
           <w:sz w:val="26"/>
           <w:szCs w:val="26"/>
         </w:rPr>
-      </w:pPr>
+        <w:t>Claim classification and grouping strategy</w:t>
+      </w:r>
+    </w:p>
+    <w:p>
+      <w:pPr>
+        <w:pStyle w:val="ListParagraph"/>
+        <w:numPr>
+          <w:ilvl w:val="0"/>
+          <w:numId w:val="11"/>
+        </w:numPr>
+      </w:pPr>
+      <w:r>
+        <w:t>EvidenceResolver</w:t>
+      </w:r>
+    </w:p>
+    <w:p>
+      <w:pPr>
+        <w:pStyle w:val="ListParagraph"/>
+        <w:rPr>
+          <w:rFonts w:hint="eastAsia"/>
+        </w:rPr>
+      </w:pPr>
+      <w:r>
+        <w:t xml:space="preserve"> </w:t>
+      </w:r>
+      <w:r>
+        <w:rPr>
+          <w:rFonts w:hint="eastAsia"/>
+        </w:rPr>
+        <w:t xml:space="preserve"> page-local classification correction</w:t>
+      </w:r>
+    </w:p>
+    <w:p/>
+    <w:p>
+      <w:pPr>
+        <w:pStyle w:val="ListParagraph"/>
+        <w:numPr>
+          <w:ilvl w:val="0"/>
+          <w:numId w:val="11"/>
+        </w:numPr>
+      </w:pPr>
+      <w:r>
+        <w:lastRenderedPageBreak/>
+        <w:t>ContextResolver</w:t>
+      </w:r>
+    </w:p>
+    <w:p>
+      <w:pPr>
+        <w:pStyle w:val="ListParagraph"/>
+        <w:rPr>
+          <w:rFonts w:hint="eastAsia"/>
+        </w:rPr>
+      </w:pPr>
+      <w:r>
+        <w:t xml:space="preserve">  </w:t>
+      </w:r>
+      <w:r>
+        <w:rPr>
+          <w:rFonts w:hint="eastAsia"/>
+        </w:rPr>
+        <w:t>recover uncertain page type using neighbouring pages</w:t>
+      </w:r>
+    </w:p>
+    <w:p/>
+    <w:p>
+      <w:pPr>
+        <w:pStyle w:val="ListParagraph"/>
+        <w:numPr>
+          <w:ilvl w:val="0"/>
+          <w:numId w:val="11"/>
+        </w:numPr>
+      </w:pPr>
+      <w:r>
+        <w:t>BoundaryResolver</w:t>
+      </w:r>
+    </w:p>
+    <w:p>
+      <w:pPr>
+        <w:pStyle w:val="ListParagraph"/>
+        <w:rPr>
+          <w:rFonts w:hint="eastAsia"/>
+        </w:rPr>
+      </w:pPr>
+      <w:r>
+        <w:t xml:space="preserve">   </w:t>
+      </w:r>
+      <w:r>
+        <w:rPr>
+          <w:rFonts w:hint="eastAsia"/>
+        </w:rPr>
+        <w:t>decide START / CONTINUATION / AMBIGUOUS</w:t>
+      </w:r>
+    </w:p>
+    <w:p/>
+    <w:p>
+      <w:pPr>
+        <w:pStyle w:val="ListParagraph"/>
+        <w:numPr>
+          <w:ilvl w:val="0"/>
+          <w:numId w:val="11"/>
+        </w:numPr>
+      </w:pPr>
+      <w:r>
+        <w:t>ContinuationResolver</w:t>
+      </w:r>
+    </w:p>
+    <w:p>
+      <w:pPr>
+        <w:pStyle w:val="ListParagraph"/>
+        <w:rPr>
+          <w:rFonts w:hint="eastAsia"/>
+        </w:rPr>
+      </w:pPr>
+      <w:r>
+        <w:t xml:space="preserve">     </w:t>
+      </w:r>
+      <w:r>
+        <w:rPr>
+          <w:rFonts w:hint="eastAsia"/>
+        </w:rPr>
+        <w:t>resolve ambiguous adjacent-page relationships</w:t>
+      </w:r>
+    </w:p>
+    <w:p/>
+    <w:p>
+      <w:pPr>
+        <w:pStyle w:val="ListParagraph"/>
+        <w:numPr>
+          <w:ilvl w:val="0"/>
+          <w:numId w:val="11"/>
+        </w:numPr>
+      </w:pPr>
+      <w:r>
+        <w:t>DocumentGroupResolver</w:t>
+      </w:r>
+    </w:p>
+    <w:p>
+      <w:pPr>
+        <w:pStyle w:val="ListParagraph"/>
+        <w:rPr>
+          <w:rFonts w:hint="eastAsia"/>
+        </w:rPr>
+      </w:pPr>
+      <w:r>
+        <w:rPr>
+          <w:rFonts w:hint="eastAsia"/>
+        </w:rPr>
+        <w:t>assign document_group_id and assemble PDFs</w:t>
+      </w:r>
+    </w:p>
+    <w:p/>
+    <w:p>
+      <w:pPr>
+        <w:pStyle w:val="ListParagraph"/>
+        <w:numPr>
+          <w:ilvl w:val="0"/>
+          <w:numId w:val="11"/>
+        </w:numPr>
+      </w:pPr>
+      <w:r>
+        <w:t>GroupValidator</w:t>
+      </w:r>
+    </w:p>
+    <w:p>
+      <w:pPr>
+        <w:pStyle w:val="ListParagraph"/>
+      </w:pPr>
+      <w:r>
+        <w:rPr>
+          <w:rFonts w:hint="eastAsia"/>
+        </w:rPr>
+        <w:t>ensure all pages are covered exactly once</w:t>
+      </w:r>
+    </w:p>
+    <w:p>
+      <w:pPr>
+        <w:rPr>
+          <w:rFonts w:asciiTheme="majorHAnsi" w:eastAsiaTheme="majorEastAsia" w:hAnsiTheme="majorHAnsi" w:cstheme="majorBidi"/>
+          <w:b/>
+          <w:bCs/>
+          <w:color w:val="4F81BD" w:themeColor="accent1"/>
+          <w:sz w:val="26"/>
+          <w:szCs w:val="26"/>
+        </w:rPr>
+      </w:pPr>
+      <w:r>
+        <w:rPr>
+          <w:rFonts w:asciiTheme="majorHAnsi" w:eastAsiaTheme="majorEastAsia" w:hAnsiTheme="majorHAnsi" w:cstheme="majorBidi"/>
+          <w:b/>
+          <w:bCs/>
+          <w:noProof/>
+          <w:color w:val="4F81BD" w:themeColor="accent1"/>
+          <w:sz w:val="26"/>
+          <w:szCs w:val="26"/>
+        </w:rPr>
+        <w:drawing>
+          <wp:inline distT="0" distB="0" distL="0" distR="0" wp14:anchorId="219483A2" wp14:editId="331832E8">
+            <wp:extent cx="6301740" cy="4201160"/>
+            <wp:effectExtent l="0" t="0" r="3810" b="8890"/>
+            <wp:docPr id="1490324306" name="Picture 2"/>
+            <wp:cNvGraphicFramePr>
+              <a:graphicFrameLocks xmlns:a="http://schemas.openxmlformats.org/drawingml/2006/main" noChangeAspect="1"/>
+            </wp:cNvGraphicFramePr>
+            <a:graphic xmlns:a="http://schemas.openxmlformats.org/drawingml/2006/main">
+              <a:graphicData uri="http://schemas.openxmlformats.org/drawingml/2006/picture">
+                <pic:pic xmlns:pic="http://schemas.openxmlformats.org/drawingml/2006/picture">
+                  <pic:nvPicPr>
+                    <pic:cNvPr id="0" name="Picture 5"/>
+                    <pic:cNvPicPr>
+                      <a:picLocks noChangeAspect="1" noChangeArrowheads="1"/>
+                    </pic:cNvPicPr>
+                  </pic:nvPicPr>
+                  <pic:blipFill>
+                    <a:blip r:embed="rId7">
+                      <a:extLst>
+                        <a:ext uri="{28A0092B-C50C-407E-A947-70E740481C1C}">
+                          <a14:useLocalDpi xmlns:a14="http://schemas.microsoft.com/office/drawing/2010/main" val="0"/>
+                        </a:ext>
+                      </a:extLst>
+                    </a:blip>
+                    <a:srcRect/>
+                    <a:stretch>
+                      <a:fillRect/>
+                    </a:stretch>
+                  </pic:blipFill>
+                  <pic:spPr bwMode="auto">
+                    <a:xfrm>
+                      <a:off x="0" y="0"/>
+                      <a:ext cx="6301740" cy="4201160"/>
+                    </a:xfrm>
+                    <a:prstGeom prst="rect">
+                      <a:avLst/>
+                    </a:prstGeom>
+                    <a:noFill/>
+                  </pic:spPr>
+                </pic:pic>
+              </a:graphicData>
+            </a:graphic>
+          </wp:inline>
+        </w:drawing>
+      </w:r>
+    </w:p>
+    <w:p>
+      <w:pPr>
+        <w:rPr>
+          <w:rFonts w:asciiTheme="majorHAnsi" w:eastAsiaTheme="majorEastAsia" w:hAnsiTheme="majorHAnsi" w:cstheme="majorBidi"/>
+          <w:b/>
+          <w:bCs/>
+          <w:color w:val="4F81BD" w:themeColor="accent1"/>
+          <w:sz w:val="26"/>
+          <w:szCs w:val="26"/>
+        </w:rPr>
+      </w:pPr>
+      <w:r>
+        <w:rPr>
+          <w:rFonts w:asciiTheme="majorHAnsi" w:eastAsiaTheme="majorEastAsia" w:hAnsiTheme="majorHAnsi" w:cstheme="majorBidi"/>
+          <w:b/>
+          <w:bCs/>
+          <w:color w:val="4F81BD" w:themeColor="accent1"/>
+          <w:sz w:val="26"/>
+          <w:szCs w:val="26"/>
+        </w:rPr>
+        <w:lastRenderedPageBreak/>
+        <w:t>implementation order</w:t>
+      </w:r>
+    </w:p>
+    <w:p>
+      <w:pPr>
+        <w:pStyle w:val="ListParagraph"/>
+        <w:numPr>
+          <w:ilvl w:val="0"/>
+          <w:numId w:val="10"/>
+        </w:numPr>
+      </w:pPr>
+      <w:r>
+        <w:t>boundary_resolver.py</w:t>
+      </w:r>
+    </w:p>
+    <w:p>
+      <w:pPr>
+        <w:pStyle w:val="ListParagraph"/>
+        <w:numPr>
+          <w:ilvl w:val="0"/>
+          <w:numId w:val="10"/>
+        </w:numPr>
+      </w:pPr>
+      <w:r>
+        <w:t>continuation_resolver.py</w:t>
+      </w:r>
+    </w:p>
+    <w:p>
+      <w:pPr>
+        <w:pStyle w:val="ListParagraph"/>
+        <w:numPr>
+          <w:ilvl w:val="0"/>
+          <w:numId w:val="10"/>
+        </w:numPr>
+      </w:pPr>
+      <w:r>
+        <w:t>document_group_resolver.py</w:t>
+      </w:r>
+    </w:p>
+    <w:p>
+      <w:pPr>
+        <w:pStyle w:val="ListParagraph"/>
+        <w:numPr>
+          <w:ilvl w:val="0"/>
+          <w:numId w:val="10"/>
+        </w:numPr>
+      </w:pPr>
+      <w:r>
+        <w:t>group_validator.py</w:t>
+      </w:r>
     </w:p>
     <w:sectPr>
       <w:pgSz w:w="12240" w:h="15840"/>
@@ -4167,6 +4036,232 @@
       </w:pPr>
       <w:rPr>
         <w:rFonts w:ascii="Symbol" w:hAnsi="Symbol" w:hint="default"/>
+      </w:rPr>
+    </w:lvl>
+  </w:abstractNum>
+  <w:abstractNum w:abstractNumId="9" w15:restartNumberingAfterBreak="0">
+    <w:nsid w:val="65F546F4"/>
+    <w:multiLevelType w:val="hybridMultilevel"/>
+    <w:tmpl w:val="9C087F1C"/>
+    <w:lvl w:ilvl="0" w:tplc="40090001">
+      <w:start w:val="1"/>
+      <w:numFmt w:val="bullet"/>
+      <w:lvlText w:val=""/>
+      <w:lvlJc w:val="left"/>
+      <w:pPr>
+        <w:ind w:left="720" w:hanging="360"/>
+      </w:pPr>
+      <w:rPr>
+        <w:rFonts w:ascii="Symbol" w:hAnsi="Symbol" w:hint="default"/>
+      </w:rPr>
+    </w:lvl>
+    <w:lvl w:ilvl="1" w:tplc="40090003" w:tentative="1">
+      <w:start w:val="1"/>
+      <w:numFmt w:val="bullet"/>
+      <w:lvlText w:val="o"/>
+      <w:lvlJc w:val="left"/>
+      <w:pPr>
+        <w:ind w:left="1440" w:hanging="360"/>
+      </w:pPr>
+      <w:rPr>
+        <w:rFonts w:ascii="Courier New" w:hAnsi="Courier New" w:cs="Courier New" w:hint="default"/>
+      </w:rPr>
+    </w:lvl>
+    <w:lvl w:ilvl="2" w:tplc="40090005" w:tentative="1">
+      <w:start w:val="1"/>
+      <w:numFmt w:val="bullet"/>
+      <w:lvlText w:val=""/>
+      <w:lvlJc w:val="left"/>
+      <w:pPr>
+        <w:ind w:left="2160" w:hanging="360"/>
+      </w:pPr>
+      <w:rPr>
+        <w:rFonts w:ascii="Wingdings" w:hAnsi="Wingdings" w:hint="default"/>
+      </w:rPr>
+    </w:lvl>
+    <w:lvl w:ilvl="3" w:tplc="40090001" w:tentative="1">
+      <w:start w:val="1"/>
+      <w:numFmt w:val="bullet"/>
+      <w:lvlText w:val=""/>
+      <w:lvlJc w:val="left"/>
+      <w:pPr>
+        <w:ind w:left="2880" w:hanging="360"/>
+      </w:pPr>
+      <w:rPr>
+        <w:rFonts w:ascii="Symbol" w:hAnsi="Symbol" w:hint="default"/>
+      </w:rPr>
+    </w:lvl>
+    <w:lvl w:ilvl="4" w:tplc="40090003" w:tentative="1">
+      <w:start w:val="1"/>
+      <w:numFmt w:val="bullet"/>
+      <w:lvlText w:val="o"/>
+      <w:lvlJc w:val="left"/>
+      <w:pPr>
+        <w:ind w:left="3600" w:hanging="360"/>
+      </w:pPr>
+      <w:rPr>
+        <w:rFonts w:ascii="Courier New" w:hAnsi="Courier New" w:cs="Courier New" w:hint="default"/>
+      </w:rPr>
+    </w:lvl>
+    <w:lvl w:ilvl="5" w:tplc="40090005" w:tentative="1">
+      <w:start w:val="1"/>
+      <w:numFmt w:val="bullet"/>
+      <w:lvlText w:val=""/>
+      <w:lvlJc w:val="left"/>
+      <w:pPr>
+        <w:ind w:left="4320" w:hanging="360"/>
+      </w:pPr>
+      <w:rPr>
+        <w:rFonts w:ascii="Wingdings" w:hAnsi="Wingdings" w:hint="default"/>
+      </w:rPr>
+    </w:lvl>
+    <w:lvl w:ilvl="6" w:tplc="40090001" w:tentative="1">
+      <w:start w:val="1"/>
+      <w:numFmt w:val="bullet"/>
+      <w:lvlText w:val=""/>
+      <w:lvlJc w:val="left"/>
+      <w:pPr>
+        <w:ind w:left="5040" w:hanging="360"/>
+      </w:pPr>
+      <w:rPr>
+        <w:rFonts w:ascii="Symbol" w:hAnsi="Symbol" w:hint="default"/>
+      </w:rPr>
+    </w:lvl>
+    <w:lvl w:ilvl="7" w:tplc="40090003" w:tentative="1">
+      <w:start w:val="1"/>
+      <w:numFmt w:val="bullet"/>
+      <w:lvlText w:val="o"/>
+      <w:lvlJc w:val="left"/>
+      <w:pPr>
+        <w:ind w:left="5760" w:hanging="360"/>
+      </w:pPr>
+      <w:rPr>
+        <w:rFonts w:ascii="Courier New" w:hAnsi="Courier New" w:cs="Courier New" w:hint="default"/>
+      </w:rPr>
+    </w:lvl>
+    <w:lvl w:ilvl="8" w:tplc="40090005" w:tentative="1">
+      <w:start w:val="1"/>
+      <w:numFmt w:val="bullet"/>
+      <w:lvlText w:val=""/>
+      <w:lvlJc w:val="left"/>
+      <w:pPr>
+        <w:ind w:left="6480" w:hanging="360"/>
+      </w:pPr>
+      <w:rPr>
+        <w:rFonts w:ascii="Wingdings" w:hAnsi="Wingdings" w:hint="default"/>
+      </w:rPr>
+    </w:lvl>
+  </w:abstractNum>
+  <w:abstractNum w:abstractNumId="10" w15:restartNumberingAfterBreak="0">
+    <w:nsid w:val="6970364E"/>
+    <w:multiLevelType w:val="hybridMultilevel"/>
+    <w:tmpl w:val="29FCFE86"/>
+    <w:lvl w:ilvl="0" w:tplc="40090001">
+      <w:start w:val="1"/>
+      <w:numFmt w:val="bullet"/>
+      <w:lvlText w:val=""/>
+      <w:lvlJc w:val="left"/>
+      <w:pPr>
+        <w:ind w:left="1440" w:hanging="360"/>
+      </w:pPr>
+      <w:rPr>
+        <w:rFonts w:ascii="Symbol" w:hAnsi="Symbol" w:hint="default"/>
+      </w:rPr>
+    </w:lvl>
+    <w:lvl w:ilvl="1" w:tplc="40090003" w:tentative="1">
+      <w:start w:val="1"/>
+      <w:numFmt w:val="bullet"/>
+      <w:lvlText w:val="o"/>
+      <w:lvlJc w:val="left"/>
+      <w:pPr>
+        <w:ind w:left="2160" w:hanging="360"/>
+      </w:pPr>
+      <w:rPr>
+        <w:rFonts w:ascii="Courier New" w:hAnsi="Courier New" w:cs="Courier New" w:hint="default"/>
+      </w:rPr>
+    </w:lvl>
+    <w:lvl w:ilvl="2" w:tplc="40090005" w:tentative="1">
+      <w:start w:val="1"/>
+      <w:numFmt w:val="bullet"/>
+      <w:lvlText w:val=""/>
+      <w:lvlJc w:val="left"/>
+      <w:pPr>
+        <w:ind w:left="2880" w:hanging="360"/>
+      </w:pPr>
+      <w:rPr>
+        <w:rFonts w:ascii="Wingdings" w:hAnsi="Wingdings" w:hint="default"/>
+      </w:rPr>
+    </w:lvl>
+    <w:lvl w:ilvl="3" w:tplc="40090001" w:tentative="1">
+      <w:start w:val="1"/>
+      <w:numFmt w:val="bullet"/>
+      <w:lvlText w:val=""/>
+      <w:lvlJc w:val="left"/>
+      <w:pPr>
+        <w:ind w:left="3600" w:hanging="360"/>
+      </w:pPr>
+      <w:rPr>
+        <w:rFonts w:ascii="Symbol" w:hAnsi="Symbol" w:hint="default"/>
+      </w:rPr>
+    </w:lvl>
+    <w:lvl w:ilvl="4" w:tplc="40090003" w:tentative="1">
+      <w:start w:val="1"/>
+      <w:numFmt w:val="bullet"/>
+      <w:lvlText w:val="o"/>
+      <w:lvlJc w:val="left"/>
+      <w:pPr>
+        <w:ind w:left="4320" w:hanging="360"/>
+      </w:pPr>
+      <w:rPr>
+        <w:rFonts w:ascii="Courier New" w:hAnsi="Courier New" w:cs="Courier New" w:hint="default"/>
+      </w:rPr>
+    </w:lvl>
+    <w:lvl w:ilvl="5" w:tplc="40090005" w:tentative="1">
+      <w:start w:val="1"/>
+      <w:numFmt w:val="bullet"/>
+      <w:lvlText w:val=""/>
+      <w:lvlJc w:val="left"/>
+      <w:pPr>
+        <w:ind w:left="5040" w:hanging="360"/>
+      </w:pPr>
+      <w:rPr>
+        <w:rFonts w:ascii="Wingdings" w:hAnsi="Wingdings" w:hint="default"/>
+      </w:rPr>
+    </w:lvl>
+    <w:lvl w:ilvl="6" w:tplc="40090001" w:tentative="1">
+      <w:start w:val="1"/>
+      <w:numFmt w:val="bullet"/>
+      <w:lvlText w:val=""/>
+      <w:lvlJc w:val="left"/>
+      <w:pPr>
+        <w:ind w:left="5760" w:hanging="360"/>
+      </w:pPr>
+      <w:rPr>
+        <w:rFonts w:ascii="Symbol" w:hAnsi="Symbol" w:hint="default"/>
+      </w:rPr>
+    </w:lvl>
+    <w:lvl w:ilvl="7" w:tplc="40090003" w:tentative="1">
+      <w:start w:val="1"/>
+      <w:numFmt w:val="bullet"/>
+      <w:lvlText w:val="o"/>
+      <w:lvlJc w:val="left"/>
+      <w:pPr>
+        <w:ind w:left="6480" w:hanging="360"/>
+      </w:pPr>
+      <w:rPr>
+        <w:rFonts w:ascii="Courier New" w:hAnsi="Courier New" w:cs="Courier New" w:hint="default"/>
+      </w:rPr>
+    </w:lvl>
+    <w:lvl w:ilvl="8" w:tplc="40090005" w:tentative="1">
+      <w:start w:val="1"/>
+      <w:numFmt w:val="bullet"/>
+      <w:lvlText w:val=""/>
+      <w:lvlJc w:val="left"/>
+      <w:pPr>
+        <w:ind w:left="7200" w:hanging="360"/>
+      </w:pPr>
+      <w:rPr>
+        <w:rFonts w:ascii="Wingdings" w:hAnsi="Wingdings" w:hint="default"/>
       </w:rPr>
     </w:lvl>
   </w:abstractNum>
@@ -4196,6 +4291,12 @@
   </w:num>
   <w:num w:numId="9" w16cid:durableId="1846481279">
     <w:abstractNumId w:val="0"/>
+  </w:num>
+  <w:num w:numId="10" w16cid:durableId="1635941683">
+    <w:abstractNumId w:val="10"/>
+  </w:num>
+  <w:num w:numId="11" w16cid:durableId="668603572">
+    <w:abstractNumId w:val="9"/>
   </w:num>
 </w:numbering>
 </file>
@@ -4803,7 +4904,6 @@
   <w:style w:type="character" w:default="1" w:styleId="DefaultParagraphFont">
     <w:name w:val="Default Paragraph Font"/>
     <w:uiPriority w:val="1"/>
-    <w:semiHidden/>
     <w:unhideWhenUsed/>
   </w:style>
   <w:style w:type="table" w:default="1" w:styleId="TableNormal">

</xml_diff>